<commit_message>
Revise the Steiner 2026 document after review
Add what worked and what didn't from the past campaigns, justify the
company sizes, map the website industries to past and new targets,
drop RVs and plastics, add links and costs for the extra lead sources,
and use custom packaging in the messages.

Co-Authored-By: Claude Opus 5.5 <noreply@anthropic.com>
Claude-Session: https://claude.ai/code/session_018AsKRCDgw5Ln2FqTPH9DBq
</commit_message>
<xml_diff>
--- a/Outreach Messages - Steiner Enterprises 2026.docx
+++ b/Outreach Messages - Steiner Enterprises 2026.docx
@@ -65,19 +65,19 @@
     <w:p>
       <w:r>
         <w:rPr/>
-        <w:t xml:space="preserve">Steiner Enterprises is based in Lafayette, Indiana, and has been in business for over 30 years. It partners with companies from design to delivery: design and engineering, prototyping, global sourcing, production and assembly, and kitting and retail packaging. It works on mechanical, electro-mechanical and electronic products, including wire harnesses, circuit boards, injection-molded parts, metal fabrication and machining. Steiner is ISO 9001:2015 certified.</w:t>
-      </w:r>
-    </w:p>
-    <w:p>
-      <w:r>
-        <w:rPr/>
-        <w:t xml:space="preserve">Its own case studies describe three kinds of projects: “Your Idea Brought to Life”, “Your Product Redesigned” and “Your Design Produced”. Typical results include a product line redesigned to a new look while hitting an aggressive price target, a costly off-the-shelf part replaced with one that ended warranty returns, and a starter kit with new retail packaging that dramatically improved the customer's sales.</w:t>
-      </w:r>
-    </w:p>
-    <w:p>
-      <w:r>
-        <w:rPr/>
-        <w:t xml:space="preserve">Steiner's website describes its production as onshore, nearshore and offshore, so the customer doesn't have to choose and manage factories on their own. Clients the team named during onboarding include RV makers and RV appliance brands, science-education companies, and consumer and sporting brands.</w:t>
+        <w:t xml:space="preserve">Steiner Enterprises is based in Lafayette, Indiana, and has been in business for over 30 years. It partners with companies from design to delivery: design and engineering, prototyping, global sourcing, production and assembly, and kitting and custom packaging. It works on mechanical, electro-mechanical and electronic products, including wire harnesses, circuit boards, injection-molded parts, metal fabrication and machining. Steiner is ISO 9001:2015 certified.</w:t>
+      </w:r>
+    </w:p>
+    <w:p>
+      <w:r>
+        <w:rPr/>
+        <w:t xml:space="preserve">Its case studies describe three kinds of projects: “Your Idea Brought to Life”, “Your Product Redesigned” and “Your Design Produced”. Examples include a product line redesigned to a new look while hitting an aggressive price target, a mismatched off-the-shelf part replaced with one that ended costly warranty returns, and a starter kit with new packaging that dramatically improved the customer's sales.</w:t>
+      </w:r>
+    </w:p>
+    <w:p>
+      <w:r>
+        <w:rPr/>
+        <w:t xml:space="preserve">Steiner's website describes its production as onshore, nearshore and offshore, so the customer doesn't have to find and manage factories on their own.</w:t>
       </w:r>
     </w:p>
     <w:p>
@@ -98,7 +98,16 @@
     <w:p>
       <w:r>
         <w:rPr/>
-        <w:t xml:space="preserve">The main points from the report (August 2024 to February 2026) that shape the next steps:</w:t>
+        <w:t xml:space="preserve">The report covers August 2024 to February 2026: 12,821 LinkedIn invitations, 3,059 accepted, 71 interested and 29 meetings.</w:t>
+      </w:r>
+    </w:p>
+    <w:p>
+      <w:pPr>
+        <w:pStyle w:val="Heading3"/>
+      </w:pPr>
+      <w:r>
+        <w:rPr/>
+        <w:t xml:space="preserve">What worked</w:t>
       </w:r>
     </w:p>
     <w:p>
@@ -115,11 +124,11 @@
           <w:b w:val="1"/>
           <w:bCs w:val="1"/>
         </w:rPr>
-        <w:t xml:space="preserve">LinkedIn brought every result:</w:t>
-      </w:r>
-      <w:r>
-        <w:rPr/>
-        <w:t xml:space="preserve"> 12,821 invitations, 3,059 accepted, 71 interested and 29 meetings. Email didn't: 13,439 emails, 14 replies, none interested. Re-invitations didn't either: 4,084 re-invites, 7 interested.</w:t>
+        <w:t xml:space="preserve">LinkedIn:</w:t>
+      </w:r>
+      <w:r>
+        <w:rPr/>
+        <w:t xml:space="preserve"> every interested lead and every meeting came from LinkedIn.</w:t>
       </w:r>
     </w:p>
     <w:p>
@@ -136,11 +145,11 @@
           <w:b w:val="1"/>
           <w:bCs w:val="1"/>
         </w:rPr>
-        <w:t xml:space="preserve">Tom's profile worked about twice as well as Josh's:</w:t>
-      </w:r>
-      <w:r>
-        <w:rPr/>
-        <w:t xml:space="preserve"> 3.1% of accepted contacts were interested on Tom's profile, against 1.4% on Josh's.</w:t>
+        <w:t xml:space="preserve">Tom's profile:</w:t>
+      </w:r>
+      <w:r>
+        <w:rPr/>
+        <w:t xml:space="preserve"> 3.1% of accepted contacts were interested, about twice Josh's 1.4%.</w:t>
       </w:r>
     </w:p>
     <w:p>
@@ -157,11 +166,11 @@
           <w:b w:val="1"/>
           <w:bCs w:val="1"/>
         </w:rPr>
-        <w:t xml:space="preserve">Small companies and decision makers replied best:</w:t>
-      </w:r>
-      <w:r>
-        <w:rPr/>
-        <w:t xml:space="preserve"> 11-50 employees (4.3% interested on Tom's profile), and owners, CEOs and supply chain managers. Engineers rarely became interested.</w:t>
+        <w:t xml:space="preserve">Small companies:</w:t>
+      </w:r>
+      <w:r>
+        <w:rPr/>
+        <w:t xml:space="preserve"> 11-50 employees had the best rate (4.3% on Tom's profile, against 1.4% for 51-200).</w:t>
       </w:r>
     </w:p>
     <w:p>
@@ -178,11 +187,11 @@
           <w:b w:val="1"/>
           <w:bCs w:val="1"/>
         </w:rPr>
-        <w:t xml:space="preserve">The best message asked a simple question:</w:t>
-      </w:r>
-      <w:r>
-        <w:rPr/>
-        <w:t xml:space="preserve"> do you handle product development in-house, or rely on contract manufacturers? It got a 38% reply rate. The quarter-based openers (“what's on your roadmap for Q2/Q4”) did worse.</w:t>
+        <w:t xml:space="preserve">Decision makers:</w:t>
+      </w:r>
+      <w:r>
+        <w:rPr/>
+        <w:t xml:space="preserve"> owners, CEOs and supply chain managers became interested most often.</w:t>
       </w:r>
     </w:p>
     <w:p>
@@ -199,11 +208,11 @@
           <w:b w:val="1"/>
           <w:bCs w:val="1"/>
         </w:rPr>
-        <w:t xml:space="preserve">Who said “not a good fit”:</w:t>
-      </w:r>
-      <w:r>
-        <w:rPr/>
-        <w:t xml:space="preserve"> 11 of the 29 meetings. The reasons included very low quantities, price, large industrial equipment, and companies that already import directly at a lower price.</w:t>
+        <w:t xml:space="preserve">A simple question:</w:t>
+      </w:r>
+      <w:r>
+        <w:rPr/>
+        <w:t xml:space="preserve"> “do you handle product development in-house, or rely on contract manufacturers?” got a 38% reply rate.</w:t>
       </w:r>
     </w:p>
     <w:p>
@@ -220,11 +229,20 @@
           <w:b w:val="1"/>
           <w:bCs w:val="1"/>
         </w:rPr>
-        <w:t xml:space="preserve">Who looked promising:</w:t>
-      </w:r>
-      <w:r>
-        <w:rPr/>
-        <w:t xml:space="preserve"> companies that sell their own branded products, such as Coastal Source (outdoor audio and lighting, marked as a potential customer), and INOVATIV, Arkansas Lighting and SSCOR, which are sending products or samples to quote. This matches Steiner's existing clients, who almost all sell branded products.</w:t>
+        <w:t xml:space="preserve">Brands with their own products:</w:t>
+      </w:r>
+      <w:r>
+        <w:rPr/>
+        <w:t xml:space="preserve"> the leads that went furthest sell branded products (Coastal Source, INOVATIV, Arkansas Lighting, SSCOR), like most of Steiner's clients.</w:t>
+      </w:r>
+    </w:p>
+    <w:p>
+      <w:pPr>
+        <w:pStyle w:val="Heading3"/>
+      </w:pPr>
+      <w:r>
+        <w:rPr/>
+        <w:t xml:space="preserve">What didn't work</w:t>
       </w:r>
     </w:p>
     <w:p>
@@ -241,26 +259,153 @@
           <w:b w:val="1"/>
           <w:bCs w:val="1"/>
         </w:rPr>
-        <w:t xml:space="preserve">What's covered:</w:t>
-      </w:r>
-      <w:r>
-        <w:rPr/>
-        <w:t xml:space="preserve"> most searches in electronics, medical, machinery, industrial machinery, motor vehicle parts, transportation, agriculture and shipbuilding are finished (11-500 employees, USA). No campaign has yet targeted consumer, sporting, education, telematics, plastics or semiconductor equipment companies.</w:t>
-      </w:r>
-    </w:p>
-    <w:p>
-      <w:pPr>
-        <w:spacing w:before="60" w:after="120"/>
-      </w:pPr>
-      <w:r>
-        <w:rPr>
-          <w:i w:val="1"/>
-          <w:iCs w:val="1"/>
-          <w:color w:val="404040"/>
-          <w:sz w:val="22"/>
-          <w:szCs w:val="22"/>
-        </w:rPr>
-        <w:t xml:space="preserve">Conclusion: instead of more manufacturing industries, we go after brands that own a product but not the full engineering and production of it. That's where Steiner's clients and best replies came from, and it hasn't been targeted yet.</w:t>
+        <w:t xml:space="preserve">Email:</w:t>
+      </w:r>
+      <w:r>
+        <w:rPr/>
+        <w:t xml:space="preserve"> 13,439 emails, 14 replies, none interested.</w:t>
+      </w:r>
+    </w:p>
+    <w:p>
+      <w:pPr>
+        <w:numPr>
+          <w:ilvl w:val="0"/>
+          <w:numId w:val="2"/>
+        </w:numPr>
+        <w:spacing w:after="0" w:before="120" w:lineRule="auto"/>
+        <w:ind w:left="720" w:hanging="360"/>
+      </w:pPr>
+      <w:r>
+        <w:rPr>
+          <w:b w:val="1"/>
+          <w:bCs w:val="1"/>
+        </w:rPr>
+        <w:t xml:space="preserve">Re-invitations:</w:t>
+      </w:r>
+      <w:r>
+        <w:rPr/>
+        <w:t xml:space="preserve"> 4,084 re-invites, 7 interested.</w:t>
+      </w:r>
+    </w:p>
+    <w:p>
+      <w:pPr>
+        <w:numPr>
+          <w:ilvl w:val="0"/>
+          <w:numId w:val="2"/>
+        </w:numPr>
+        <w:spacing w:after="0" w:before="120" w:lineRule="auto"/>
+        <w:ind w:left="720" w:hanging="360"/>
+      </w:pPr>
+      <w:r>
+        <w:rPr>
+          <w:b w:val="1"/>
+          <w:bCs w:val="1"/>
+        </w:rPr>
+        <w:t xml:space="preserve">Engineering and product development titles:</w:t>
+      </w:r>
+      <w:r>
+        <w:rPr/>
+        <w:t xml:space="preserve"> they accepted, but rarely became interested.</w:t>
+      </w:r>
+    </w:p>
+    <w:p>
+      <w:pPr>
+        <w:numPr>
+          <w:ilvl w:val="0"/>
+          <w:numId w:val="2"/>
+        </w:numPr>
+        <w:spacing w:after="0" w:before="120" w:lineRule="auto"/>
+        <w:ind w:left="720" w:hanging="360"/>
+      </w:pPr>
+      <w:r>
+        <w:rPr/>
+        <w:t xml:space="preserve">Quarter-based openers (“what's on your roadmap for Q2/Q4”) and the general “free consultation” offer.</w:t>
+      </w:r>
+    </w:p>
+    <w:p>
+      <w:pPr>
+        <w:numPr>
+          <w:ilvl w:val="0"/>
+          <w:numId w:val="2"/>
+        </w:numPr>
+        <w:spacing w:after="0" w:before="120" w:lineRule="auto"/>
+        <w:ind w:left="720" w:hanging="360"/>
+      </w:pPr>
+      <w:r>
+        <w:rPr>
+          <w:b w:val="1"/>
+          <w:bCs w:val="1"/>
+        </w:rPr>
+        <w:t xml:space="preserve">Not a good fit (11 of 29 meetings):</w:t>
+      </w:r>
+      <w:r>
+        <w:rPr/>
+        <w:t xml:space="preserve"> very low quantities, price, large industrial machines, and companies already importing directly at a lower price.</w:t>
+      </w:r>
+    </w:p>
+    <w:p>
+      <w:pPr>
+        <w:pStyle w:val="Heading3"/>
+      </w:pPr>
+      <w:r>
+        <w:rPr/>
+        <w:t xml:space="preserve">Conclusions for the next outreach</w:t>
+      </w:r>
+    </w:p>
+    <w:p>
+      <w:pPr>
+        <w:numPr>
+          <w:ilvl w:val="0"/>
+          <w:numId w:val="2"/>
+        </w:numPr>
+        <w:spacing w:after="0" w:before="120" w:lineRule="auto"/>
+        <w:ind w:left="720" w:hanging="360"/>
+      </w:pPr>
+      <w:r>
+        <w:rPr/>
+        <w:t xml:space="preserve">Go after brands that own a product but not all the engineering and production behind it. That's where Steiner's clients and best replies came from, and it hasn't been targeted yet.</w:t>
+      </w:r>
+    </w:p>
+    <w:p>
+      <w:pPr>
+        <w:numPr>
+          <w:ilvl w:val="0"/>
+          <w:numId w:val="2"/>
+        </w:numPr>
+        <w:spacing w:after="0" w:before="120" w:lineRule="auto"/>
+        <w:ind w:left="720" w:hanging="360"/>
+      </w:pPr>
+      <w:r>
+        <w:rPr/>
+        <w:t xml:space="preserve">Stay on LinkedIn, mainly from Tom's profile, and keep email to a small test.</w:t>
+      </w:r>
+    </w:p>
+    <w:p>
+      <w:pPr>
+        <w:numPr>
+          <w:ilvl w:val="0"/>
+          <w:numId w:val="2"/>
+        </w:numPr>
+        <w:spacing w:after="0" w:before="120" w:lineRule="auto"/>
+        <w:ind w:left="720" w:hanging="360"/>
+      </w:pPr>
+      <w:r>
+        <w:rPr/>
+        <w:t xml:space="preserve">Reach owners and sourcing or supply chain people first, and drop re-invitations.</w:t>
+      </w:r>
+    </w:p>
+    <w:p>
+      <w:pPr>
+        <w:numPr>
+          <w:ilvl w:val="0"/>
+          <w:numId w:val="2"/>
+        </w:numPr>
+        <w:spacing w:after="0" w:before="120" w:lineRule="auto"/>
+        <w:ind w:left="720" w:hanging="360"/>
+      </w:pPr>
+      <w:r>
+        <w:rPr/>
+        <w:t xml:space="preserve">Present Steiner from a new angle, with concrete examples and a concrete offer instead of a general consultation.</w:t>
       </w:r>
     </w:p>
     <w:p>
@@ -275,7 +420,456 @@
     <w:p>
       <w:r>
         <w:rPr/>
-        <w:t xml:space="preserve">All targets are in the USA, exclude every company already contacted (the report databases hold 4,254), and exclude existing clients. The employee ranges follow the onboarding form (25-100 employees, $1-100M revenue) and the past results, where 11-50 worked best.</w:t>
+        <w:t xml:space="preserve">All targets are in the USA, exclude every company already contacted (4,254 in the report databases) and exclude existing clients.</w:t>
+      </w:r>
+    </w:p>
+    <w:p>
+      <w:r>
+        <w:rPr/>
+        <w:t xml:space="preserve">Steiner's website lists the industries it serves. This is how they map to past and new targets:</w:t>
+      </w:r>
+    </w:p>
+    <w:tbl>
+      <w:tblPr>
+        <w:tblW w:w="9880" w:type="dxa"/>
+        <w:tblBorders>
+          <w:top w:val="single" w:sz="4" w:space="0" w:color="A6A6A6"/>
+          <w:left w:val="single" w:sz="4" w:space="0" w:color="A6A6A6"/>
+          <w:bottom w:val="single" w:sz="4" w:space="0" w:color="A6A6A6"/>
+          <w:right w:val="single" w:sz="4" w:space="0" w:color="A6A6A6"/>
+          <w:insideH w:val="single" w:sz="4" w:space="0" w:color="A6A6A6"/>
+          <w:insideV w:val="single" w:sz="4" w:space="0" w:color="A6A6A6"/>
+        </w:tblBorders>
+        <w:tblLayout w:type="fixed"/>
+        <w:tblCellMar>
+          <w:top w:w="60" w:type="dxa"/>
+          <w:left w:w="100" w:type="dxa"/>
+          <w:bottom w:w="60" w:type="dxa"/>
+          <w:right w:w="100" w:type="dxa"/>
+        </w:tblCellMar>
+      </w:tblPr>
+      <w:tblGrid>
+        <w:gridCol w:w="2700"/>
+        <w:gridCol w:w="4200"/>
+        <w:gridCol w:w="2980"/>
+      </w:tblGrid>
+      <w:tr>
+        <w:trPr>
+          <w:tblHeader/>
+        </w:trPr>
+        <w:tc>
+          <w:tcPr>
+            <w:tcW w:w="2700" w:type="dxa"/>
+            <w:shd w:val="clear" w:color="auto" w:fill="1F497D"/>
+          </w:tcPr>
+          <w:p>
+            <w:pPr>
+              <w:spacing w:before="0" w:after="40"/>
+              <w:jc w:val="left"/>
+            </w:pPr>
+            <w:r>
+              <w:rPr>
+                <w:b w:val="1"/>
+                <w:bCs w:val="1"/>
+                <w:color w:val="FFFFFF"/>
+                <w:sz w:val="20"/>
+                <w:szCs w:val="20"/>
+              </w:rPr>
+              <w:t xml:space="preserve">Industry on the website</w:t>
+            </w:r>
+          </w:p>
+        </w:tc>
+        <w:tc>
+          <w:tcPr>
+            <w:tcW w:w="4200" w:type="dxa"/>
+            <w:shd w:val="clear" w:color="auto" w:fill="1F497D"/>
+          </w:tcPr>
+          <w:p>
+            <w:pPr>
+              <w:spacing w:before="0" w:after="40"/>
+              <w:jc w:val="left"/>
+            </w:pPr>
+            <w:r>
+              <w:rPr>
+                <w:b w:val="1"/>
+                <w:bCs w:val="1"/>
+                <w:color w:val="FFFFFF"/>
+                <w:sz w:val="20"/>
+                <w:szCs w:val="20"/>
+              </w:rPr>
+              <w:t xml:space="preserve">Covered before</w:t>
+            </w:r>
+          </w:p>
+        </w:tc>
+        <w:tc>
+          <w:tcPr>
+            <w:tcW w:w="2980" w:type="dxa"/>
+            <w:shd w:val="clear" w:color="auto" w:fill="1F497D"/>
+          </w:tcPr>
+          <w:p>
+            <w:pPr>
+              <w:spacing w:before="0" w:after="40"/>
+              <w:jc w:val="left"/>
+            </w:pPr>
+            <w:r>
+              <w:rPr>
+                <w:b w:val="1"/>
+                <w:bCs w:val="1"/>
+                <w:color w:val="FFFFFF"/>
+                <w:sz w:val="20"/>
+                <w:szCs w:val="20"/>
+              </w:rPr>
+              <w:t xml:space="preserve">Next</w:t>
+            </w:r>
+          </w:p>
+        </w:tc>
+      </w:tr>
+      <w:tr>
+        <w:tc>
+          <w:tcPr>
+            <w:tcW w:w="2700" w:type="dxa"/>
+          </w:tcPr>
+          <w:p>
+            <w:pPr>
+              <w:spacing w:before="0" w:after="40"/>
+              <w:jc w:val="left"/>
+            </w:pPr>
+            <w:r>
+              <w:rPr>
+                <w:sz w:val="20"/>
+                <w:szCs w:val="20"/>
+              </w:rPr>
+              <w:t xml:space="preserve">Industrial</w:t>
+            </w:r>
+          </w:p>
+        </w:tc>
+        <w:tc>
+          <w:tcPr>
+            <w:tcW w:w="4200" w:type="dxa"/>
+          </w:tcPr>
+          <w:p>
+            <w:pPr>
+              <w:spacing w:before="0" w:after="40"/>
+              <w:jc w:val="left"/>
+            </w:pPr>
+            <w:r>
+              <w:rPr>
+                <w:sz w:val="20"/>
+                <w:szCs w:val="20"/>
+              </w:rPr>
+              <w:t xml:space="preserve">Yes: machinery, industrial machinery, metalworking, agriculture, shipbuilding (mostly finished)</w:t>
+            </w:r>
+          </w:p>
+        </w:tc>
+        <w:tc>
+          <w:tcPr>
+            <w:tcW w:w="2980" w:type="dxa"/>
+          </w:tcPr>
+          <w:p>
+            <w:pPr>
+              <w:spacing w:before="0" w:after="40"/>
+              <w:jc w:val="left"/>
+            </w:pPr>
+            <w:r>
+              <w:rPr>
+                <w:sz w:val="20"/>
+                <w:szCs w:val="20"/>
+              </w:rPr>
+              <w:t xml:space="preserve">Only unfinished searches and new roles (target 5)</w:t>
+            </w:r>
+          </w:p>
+        </w:tc>
+      </w:tr>
+      <w:tr>
+        <w:tc>
+          <w:tcPr>
+            <w:tcW w:w="2700" w:type="dxa"/>
+          </w:tcPr>
+          <w:p>
+            <w:pPr>
+              <w:spacing w:before="0" w:after="40"/>
+              <w:jc w:val="left"/>
+            </w:pPr>
+            <w:r>
+              <w:rPr>
+                <w:sz w:val="20"/>
+                <w:szCs w:val="20"/>
+              </w:rPr>
+              <w:t xml:space="preserve">Electronics</w:t>
+            </w:r>
+          </w:p>
+        </w:tc>
+        <w:tc>
+          <w:tcPr>
+            <w:tcW w:w="4200" w:type="dxa"/>
+          </w:tcPr>
+          <w:p>
+            <w:pPr>
+              <w:spacing w:before="0" w:after="40"/>
+              <w:jc w:val="left"/>
+            </w:pPr>
+            <w:r>
+              <w:rPr>
+                <w:sz w:val="20"/>
+                <w:szCs w:val="20"/>
+              </w:rPr>
+              <w:t xml:space="preserve">Yes: appliances, electrical and electronics, computers and electronics, electrical equipment, lighting (mostly finished)</w:t>
+            </w:r>
+          </w:p>
+        </w:tc>
+        <w:tc>
+          <w:tcPr>
+            <w:tcW w:w="2980" w:type="dxa"/>
+          </w:tcPr>
+          <w:p>
+            <w:pPr>
+              <w:spacing w:before="0" w:after="40"/>
+              <w:jc w:val="left"/>
+            </w:pPr>
+            <w:r>
+              <w:rPr>
+                <w:sz w:val="20"/>
+                <w:szCs w:val="20"/>
+              </w:rPr>
+              <w:t xml:space="preserve">Only unfinished searches and new roles (target 5)</w:t>
+            </w:r>
+          </w:p>
+        </w:tc>
+      </w:tr>
+      <w:tr>
+        <w:tc>
+          <w:tcPr>
+            <w:tcW w:w="2700" w:type="dxa"/>
+          </w:tcPr>
+          <w:p>
+            <w:pPr>
+              <w:spacing w:before="0" w:after="40"/>
+              <w:jc w:val="left"/>
+            </w:pPr>
+            <w:r>
+              <w:rPr>
+                <w:sz w:val="20"/>
+                <w:szCs w:val="20"/>
+              </w:rPr>
+              <w:t xml:space="preserve">Consumer Goods</w:t>
+            </w:r>
+          </w:p>
+        </w:tc>
+        <w:tc>
+          <w:tcPr>
+            <w:tcW w:w="4200" w:type="dxa"/>
+          </w:tcPr>
+          <w:p>
+            <w:pPr>
+              <w:spacing w:before="0" w:after="40"/>
+              <w:jc w:val="left"/>
+            </w:pPr>
+            <w:r>
+              <w:rPr>
+                <w:sz w:val="20"/>
+                <w:szCs w:val="20"/>
+              </w:rPr>
+              <w:t xml:space="preserve">No</w:t>
+            </w:r>
+          </w:p>
+        </w:tc>
+        <w:tc>
+          <w:tcPr>
+            <w:tcW w:w="2980" w:type="dxa"/>
+          </w:tcPr>
+          <w:p>
+            <w:pPr>
+              <w:spacing w:before="0" w:after="40"/>
+              <w:jc w:val="left"/>
+            </w:pPr>
+            <w:r>
+              <w:rPr>
+                <w:sz w:val="20"/>
+                <w:szCs w:val="20"/>
+              </w:rPr>
+              <w:t xml:space="preserve">Target 1</w:t>
+            </w:r>
+          </w:p>
+        </w:tc>
+      </w:tr>
+      <w:tr>
+        <w:tc>
+          <w:tcPr>
+            <w:tcW w:w="2700" w:type="dxa"/>
+          </w:tcPr>
+          <w:p>
+            <w:pPr>
+              <w:spacing w:before="0" w:after="40"/>
+              <w:jc w:val="left"/>
+            </w:pPr>
+            <w:r>
+              <w:rPr>
+                <w:sz w:val="20"/>
+                <w:szCs w:val="20"/>
+              </w:rPr>
+              <w:t xml:space="preserve">Commercial and Retail</w:t>
+            </w:r>
+          </w:p>
+        </w:tc>
+        <w:tc>
+          <w:tcPr>
+            <w:tcW w:w="4200" w:type="dxa"/>
+          </w:tcPr>
+          <w:p>
+            <w:pPr>
+              <w:spacing w:before="0" w:after="40"/>
+              <w:jc w:val="left"/>
+            </w:pPr>
+            <w:r>
+              <w:rPr>
+                <w:sz w:val="20"/>
+                <w:szCs w:val="20"/>
+              </w:rPr>
+              <w:t xml:space="preserve">No</w:t>
+            </w:r>
+          </w:p>
+        </w:tc>
+        <w:tc>
+          <w:tcPr>
+            <w:tcW w:w="2980" w:type="dxa"/>
+          </w:tcPr>
+          <w:p>
+            <w:pPr>
+              <w:spacing w:before="0" w:after="40"/>
+              <w:jc w:val="left"/>
+            </w:pPr>
+            <w:r>
+              <w:rPr>
+                <w:sz w:val="20"/>
+                <w:szCs w:val="20"/>
+              </w:rPr>
+              <w:t xml:space="preserve">Target 1 (brands that sell through retail)</w:t>
+            </w:r>
+          </w:p>
+        </w:tc>
+      </w:tr>
+      <w:tr>
+        <w:tc>
+          <w:tcPr>
+            <w:tcW w:w="2700" w:type="dxa"/>
+          </w:tcPr>
+          <w:p>
+            <w:pPr>
+              <w:spacing w:before="0" w:after="40"/>
+              <w:jc w:val="left"/>
+            </w:pPr>
+            <w:r>
+              <w:rPr>
+                <w:sz w:val="20"/>
+                <w:szCs w:val="20"/>
+              </w:rPr>
+              <w:t xml:space="preserve">Science Instrumentation</w:t>
+            </w:r>
+          </w:p>
+        </w:tc>
+        <w:tc>
+          <w:tcPr>
+            <w:tcW w:w="4200" w:type="dxa"/>
+          </w:tcPr>
+          <w:p>
+            <w:pPr>
+              <w:spacing w:before="0" w:after="40"/>
+              <w:jc w:val="left"/>
+            </w:pPr>
+            <w:r>
+              <w:rPr>
+                <w:sz w:val="20"/>
+                <w:szCs w:val="20"/>
+              </w:rPr>
+              <w:t xml:space="preserve">Partly: measuring and control instruments, 11-500 (51 companies)</w:t>
+            </w:r>
+          </w:p>
+        </w:tc>
+        <w:tc>
+          <w:tcPr>
+            <w:tcW w:w="2980" w:type="dxa"/>
+          </w:tcPr>
+          <w:p>
+            <w:pPr>
+              <w:spacing w:before="0" w:after="40"/>
+              <w:jc w:val="left"/>
+            </w:pPr>
+            <w:r>
+              <w:rPr>
+                <w:sz w:val="20"/>
+                <w:szCs w:val="20"/>
+              </w:rPr>
+              <w:t xml:space="preserve">Target 4</w:t>
+            </w:r>
+          </w:p>
+        </w:tc>
+      </w:tr>
+      <w:tr>
+        <w:tc>
+          <w:tcPr>
+            <w:tcW w:w="2700" w:type="dxa"/>
+          </w:tcPr>
+          <w:p>
+            <w:pPr>
+              <w:spacing w:before="0" w:after="40"/>
+              <w:jc w:val="left"/>
+            </w:pPr>
+            <w:r>
+              <w:rPr>
+                <w:sz w:val="20"/>
+                <w:szCs w:val="20"/>
+              </w:rPr>
+              <w:t xml:space="preserve">Recreational Vehicles</w:t>
+            </w:r>
+          </w:p>
+        </w:tc>
+        <w:tc>
+          <w:tcPr>
+            <w:tcW w:w="4200" w:type="dxa"/>
+          </w:tcPr>
+          <w:p>
+            <w:pPr>
+              <w:spacing w:before="0" w:after="40"/>
+              <w:jc w:val="left"/>
+            </w:pPr>
+            <w:r>
+              <w:rPr>
+                <w:sz w:val="20"/>
+                <w:szCs w:val="20"/>
+              </w:rPr>
+              <w:t xml:space="preserve">Clients only</w:t>
+            </w:r>
+          </w:p>
+        </w:tc>
+        <w:tc>
+          <w:tcPr>
+            <w:tcW w:w="2980" w:type="dxa"/>
+          </w:tcPr>
+          <w:p>
+            <w:pPr>
+              <w:spacing w:before="0" w:after="40"/>
+              <w:jc w:val="left"/>
+            </w:pPr>
+            <w:r>
+              <w:rPr>
+                <w:sz w:val="20"/>
+                <w:szCs w:val="20"/>
+              </w:rPr>
+              <w:t xml:space="preserve">Later, with the new RV solution</w:t>
+            </w:r>
+          </w:p>
+        </w:tc>
+      </w:tr>
+    </w:tbl>
+    <w:p>
+      <w:pPr>
+        <w:spacing w:before="0" w:after="0"/>
+      </w:pPr>
+    </w:p>
+    <w:p>
+      <w:r>
+        <w:rPr/>
+        <w:t xml:space="preserve">Two more targets come from Steiner's dream prospects and case studies rather than the website list: vehicle accessories (target 2) and fleet and telematics hardware (target 3).</w:t>
       </w:r>
     </w:p>
     <w:tbl>
@@ -413,20 +1007,20 @@
                 <w:sz w:val="20"/>
                 <w:szCs w:val="20"/>
               </w:rPr>
-              <w:t xml:space="preserve">1. Consumer and outdoor product brands (starting point)</w:t>
-            </w:r>
-          </w:p>
-          <w:p>
-            <w:pPr>
-              <w:spacing w:before="0" w:after="40"/>
-              <w:jc w:val="left"/>
-            </w:pPr>
-            <w:r>
-              <w:rPr>
-                <w:sz w:val="20"/>
-                <w:szCs w:val="20"/>
-              </w:rPr>
-              <w:t xml:space="preserve">Home and garden, outdoor and sporting, hardware, pet, lighting and small electronics sold through retail and online</w:t>
+              <w:t xml:space="preserve">1. Consumer and retail product brands (starting point)</w:t>
+            </w:r>
+          </w:p>
+          <w:p>
+            <w:pPr>
+              <w:spacing w:before="0" w:after="40"/>
+              <w:jc w:val="left"/>
+            </w:pPr>
+            <w:r>
+              <w:rPr>
+                <w:sz w:val="20"/>
+                <w:szCs w:val="20"/>
+              </w:rPr>
+              <w:t xml:space="preserve">Home and garden, outdoor and sporting, hardware, pet, lighting and small electronics, sold through retail and online</w:t>
             </w:r>
           </w:p>
         </w:tc>
@@ -444,7 +1038,7 @@
                 <w:sz w:val="20"/>
                 <w:szCs w:val="20"/>
               </w:rPr>
-              <w:t xml:space="preserve">Dream prospects: Ace Hardware and Tractor Supply vendors. Clients: Holscher, Fisher Athletic, Blichmann. Case studies: fan, LED light, speaker, USB charger, pole box sets. Interested before: Audeze, Coastal Source, Insteon, Big Dot Lighting. Not targeted yet</w:t>
+              <w:t xml:space="preserve">Website: Consumer Goods, Commercial and Retail. Dream prospects: Ace Hardware and Tractor Supply vendors. Clients: Holscher, Fisher Athletic, Blichmann. Case studies: fan, LED light, speaker, USB charger, pole box sets. Interested before: Audeze, Coastal Source, Insteon, Big Dot Lighting</w:t>
             </w:r>
           </w:p>
         </w:tc>
@@ -462,7 +1056,7 @@
                 <w:sz w:val="20"/>
                 <w:szCs w:val="20"/>
               </w:rPr>
-              <w:t xml:space="preserve">11-50 first, then 51-200; revenue $1M+</w:t>
+              <w:t xml:space="preserve">11-50, then 51-200; test 201-1,000</w:t>
             </w:r>
           </w:p>
         </w:tc>
@@ -480,7 +1074,7 @@
                 <w:sz w:val="20"/>
                 <w:szCs w:val="20"/>
               </w:rPr>
-              <w:t xml:space="preserve">Owner, Founder, CEO, President; VP/Director of Operations; Supply Chain, Sourcing, Purchasing; Head of Product Development</w:t>
+              <w:t xml:space="preserve">Owner, Founder, CEO, President; VP/Director of Operations; Supply Chain, Sourcing, Purchasing</w:t>
             </w:r>
           </w:p>
         </w:tc>
@@ -502,20 +1096,20 @@
                 <w:sz w:val="20"/>
                 <w:szCs w:val="20"/>
               </w:rPr>
-              <w:t xml:space="preserve">2. Vehicle, trailer and marine accessory brands</w:t>
-            </w:r>
-          </w:p>
-          <w:p>
-            <w:pPr>
-              <w:spacing w:before="0" w:after="40"/>
-              <w:jc w:val="left"/>
-            </w:pPr>
-            <w:r>
-              <w:rPr>
-                <w:sz w:val="20"/>
-                <w:szCs w:val="20"/>
-              </w:rPr>
-              <w:t xml:space="preserve">Aftermarket automotive, off-road, powersports, trailer and marine accessories</w:t>
+              <w:t xml:space="preserve">2. Vehicle accessory brands</w:t>
+            </w:r>
+          </w:p>
+          <w:p>
+            <w:pPr>
+              <w:spacing w:before="0" w:after="40"/>
+              <w:jc w:val="left"/>
+            </w:pPr>
+            <w:r>
+              <w:rPr>
+                <w:sz w:val="20"/>
+                <w:szCs w:val="20"/>
+              </w:rPr>
+              <w:t xml:space="preserve">Aftermarket automotive, off-road, powersports and marine accessories</w:t>
             </w:r>
           </w:p>
         </w:tc>
@@ -533,7 +1127,7 @@
                 <w:sz w:val="20"/>
                 <w:szCs w:val="20"/>
               </w:rPr>
-              <w:t xml:space="preserve">RV clients; Steiner's “Automotive/RV” work; hitch products; 12V case studies (voltage booster, barcode scanner, USB charger). Interested before: Mile Marker, Agile Offroad, AFCO, Dash Designs. Motor vehicle parts had the best rate (7.7%, small sample)</w:t>
+              <w:t xml:space="preserve">Steiner's automotive work and hitch products; 12V case studies (voltage booster, barcode scanner, USB charger). Interested before: Mile Marker, Agile Offroad, AFCO, Dash Designs. Motor vehicle parts had the best rate (7.7%, small sample)</w:t>
             </w:r>
           </w:p>
         </w:tc>
@@ -551,7 +1145,7 @@
                 <w:sz w:val="20"/>
                 <w:szCs w:val="20"/>
               </w:rPr>
-              <w:t xml:space="preserve">11-50, 51-200</w:t>
+              <w:t xml:space="preserve">11-200</w:t>
             </w:r>
           </w:p>
         </w:tc>
@@ -569,7 +1163,7 @@
                 <w:sz w:val="20"/>
                 <w:szCs w:val="20"/>
               </w:rPr>
-              <w:t xml:space="preserve">Owner, President; VP/Director of Operations; Product Manager; Purchasing</w:t>
+              <w:t xml:space="preserve">Owner, President; VP/Director of Operations; Purchasing; Product Manager</w:t>
             </w:r>
           </w:p>
         </w:tc>
@@ -640,7 +1234,7 @@
                 <w:sz w:val="20"/>
                 <w:szCs w:val="20"/>
               </w:rPr>
-              <w:t xml:space="preserve">11-200, up to 500</w:t>
+              <w:t xml:space="preserve">11-500</w:t>
             </w:r>
           </w:p>
         </w:tc>
@@ -680,7 +1274,20 @@
                 <w:sz w:val="20"/>
                 <w:szCs w:val="20"/>
               </w:rPr>
-              <w:t xml:space="preserve">4. Science, STEM and lab education products</w:t>
+              <w:t xml:space="preserve">4. Science instrumentation and education products</w:t>
+            </w:r>
+          </w:p>
+          <w:p>
+            <w:pPr>
+              <w:spacing w:before="0" w:after="40"/>
+              <w:jc w:val="left"/>
+            </w:pPr>
+            <w:r>
+              <w:rPr>
+                <w:sz w:val="20"/>
+                <w:szCs w:val="20"/>
+              </w:rPr>
+              <w:t xml:space="preserve">Classroom and teaching-lab equipment, STEM kits, scientific instruments</w:t>
             </w:r>
           </w:p>
         </w:tc>
@@ -698,7 +1305,7 @@
                 <w:sz w:val="20"/>
                 <w:szCs w:val="20"/>
               </w:rPr>
-              <w:t xml:space="preserve">Six clients (Flinn, Vernier, Carolina, Arbor, School Specialty, VWR) and six case studies. Smaller niche. Need the client's OK to approach competitors of their clients</w:t>
+              <w:t xml:space="preserve">Website: Science Instrumentation. Six clients (Flinn, Vernier, Carolina, Arbor, School Specialty, VWR) and six case studies. A smaller niche. Need the client's OK to approach competitors of their clients</w:t>
             </w:r>
           </w:p>
         </w:tc>
@@ -716,7 +1323,7 @@
                 <w:sz w:val="20"/>
                 <w:szCs w:val="20"/>
               </w:rPr>
-              <w:t xml:space="preserve">11-500</w:t>
+              <w:t xml:space="preserve">11-1,000</w:t>
             </w:r>
           </w:p>
         </w:tc>
@@ -774,7 +1381,7 @@
                 <w:sz w:val="20"/>
                 <w:szCs w:val="20"/>
               </w:rPr>
-              <w:t xml:space="preserve">Unfinished searches (electronics and industrial machinery 11-50 with 1-50 followers; medical 11-50 and 51-200). Plastics and semiconductor equipment: approved but never run. 3,437 contacted companies where we never reached supply chain or purchasing</w:t>
+              <w:t xml:space="preserve">Unfinished searches: electronics and industrial machinery 11-50 (1-50 followers), medical 11-50 and 51-200. New roles: 3,437 contacted companies where we never reached supply chain or purchasing</w:t>
             </w:r>
           </w:p>
         </w:tc>
@@ -833,7 +1440,37 @@
           <w:sz w:val="22"/>
           <w:szCs w:val="22"/>
         </w:rPr>
-        <w:t xml:space="preserve">Re-engaging the 71 interested leads from the past campaigns isn't a new target, but it's the quickest way to calls. We suggest a short reconnect message to them, and to the ones who asked to talk later, from the profile they first spoke with.</w:t>
+        <w:t xml:space="preserve">Target 4 is not medical: these are teaching and lab products for schools and universities, which need no FDA approval. Clinical and diagnostic lab devices stay out. Plastics manufacturing is not suggested either: those companies mostly make plastic parts themselves (molding, extrusion) and are closer to Steiner's suppliers than its customers. RVs will be targeted later with Steiner's new RV solution.</w:t>
+      </w:r>
+    </w:p>
+    <w:p>
+      <w:pPr>
+        <w:spacing w:before="60" w:after="120"/>
+      </w:pPr>
+      <w:r>
+        <w:rPr>
+          <w:i w:val="1"/>
+          <w:iCs w:val="1"/>
+          <w:color w:val="404040"/>
+          <w:sz w:val="22"/>
+          <w:szCs w:val="22"/>
+        </w:rPr>
+        <w:t xml:space="preserve">Re-engaging the 71 interested leads from the past campaigns isn't a new target, but it's the quickest way to calls. We suggest a short reconnect message to them from the profile they first spoke with.</w:t>
+      </w:r>
+    </w:p>
+    <w:p>
+      <w:pPr>
+        <w:pStyle w:val="Heading3"/>
+      </w:pPr>
+      <w:r>
+        <w:rPr/>
+        <w:t xml:space="preserve">Company size</w:t>
+      </w:r>
+    </w:p>
+    <w:p>
+      <w:r>
+        <w:rPr/>
+        <w:t xml:space="preserve">We don't rely only on the onboarding form (25-100 employees, $1-100M revenue). In the report, 11-50 employees worked best (4.3% interested on Tom's profile), 51-200 gave 1.4%, and 201-500 gave 2.0% on a small sample. Larger companies were never tried. Steiner's clients range from 11-50 (Holscher, Blichmann) to 201-1,000 (Flinn, Carolina, Suburban, CalAmp, BYK-Gardner), and the RV makers are larger still. So Steiner can serve bigger companies, but the way in is different. Small brands have no engineering team or factories of their own, and the owner decides, so we start there. Brands of 201-1,000 usually have a product or sourcing team and buy from several suppliers, so they're worth a test, but only through sourcing, supply chain and product roles, with longer sales cycles in mind (the onboarding form gives 6-12 months). We leave out 1-10 employees, where volumes are too low (a common “not a good fit” reason), and 1,000+, where formal supplier programs make cold outreach slow, except for specialty divisions, which suit a short hand-picked list for Tom.</w:t>
       </w:r>
     </w:p>
     <w:p>
@@ -863,7 +1500,7 @@
       </w:r>
       <w:r>
         <w:rPr/>
-        <w:t xml:space="preserve"> it matches Steiner's dream prospects, several existing clients, and most of their case studies, including retail packaging.</w:t>
+        <w:t xml:space="preserve"> it matches two industries on Steiner's website, the dream prospects, several clients and most of the case studies.</w:t>
       </w:r>
     </w:p>
     <w:p>
@@ -884,7 +1521,7 @@
       </w:r>
       <w:r>
         <w:rPr/>
-        <w:t xml:space="preserve"> brands of this type replied with interest before, even though we only reached them by accident through electronics searches.</w:t>
+        <w:t xml:space="preserve"> brands of this type replied with interest before, even though we only reached them by chance through electronics searches.</w:t>
       </w:r>
     </w:p>
     <w:p>
@@ -941,7 +1578,7 @@
           <w:sz w:val="22"/>
           <w:szCs w:val="22"/>
         </w:rPr>
-        <w:t xml:space="preserve">Target 2 is the natural second step: it uses the same angle with a vehicle-accessory focus. Target 3 is a good test for Josh's profile, given his engineering background.</w:t>
+        <w:t xml:space="preserve">Target 2 is the natural second step: the same angle with a vehicle focus. Target 3 is a good test for Josh's profile, given his engineering background.</w:t>
       </w:r>
     </w:p>
     <w:p>
@@ -977,7 +1614,7 @@
       </w:r>
       <w:r>
         <w:rPr/>
-        <w:t xml:space="preserve"> United States. Headcount: 11-50 (first), then 51-200. Annual revenue: $1M-$100M, to avoid very small volumes.</w:t>
+        <w:t xml:space="preserve"> United States. Headcount: 11-50 first, then 51-200; 201-1,000 as a test with sourcing roles only. Annual revenue: $1M+.</w:t>
       </w:r>
     </w:p>
     <w:p>
@@ -1040,7 +1677,7 @@
       </w:r>
       <w:r>
         <w:rPr/>
-        <w:t xml:space="preserve"> Owner, Founder, CEO, President, VP of Operations, Director of Operations, COO.</w:t>
+        <w:t xml:space="preserve"> Owner, Founder, CEO, President, COO, VP/Director of Operations.</w:t>
       </w:r>
     </w:p>
     <w:p>
@@ -1061,7 +1698,7 @@
       </w:r>
       <w:r>
         <w:rPr/>
-        <w:t xml:space="preserve"> Supply Chain Manager/Director, Sourcing Manager/Director, Purchasing Manager/Director, Head of Product Development, Product Development Manager.</w:t>
+        <w:t xml:space="preserve"> Supply Chain, Sourcing and Purchasing Manager/Director/Head.</w:t>
       </w:r>
     </w:p>
     <w:p>
@@ -1082,7 +1719,7 @@
       </w:r>
       <w:r>
         <w:rPr/>
-        <w:t xml:space="preserve"> the 4,254 companies in the report databases, existing clients, retailers themselves (we want the brands that supply them), and distributors with no products of their own.</w:t>
+        <w:t xml:space="preserve"> the 4,254 companies in the report databases, existing clients, retailers themselves (we want the brands that supply them), RV companies, and distributors with no products of their own.</w:t>
       </w:r>
     </w:p>
     <w:p>
@@ -1103,7 +1740,7 @@
       </w:r>
       <w:r>
         <w:rPr/>
-        <w:t xml:space="preserve"> the same industries and keywords, plus the “founded” and “revenue” filters. Apollo also finds brands that sell mostly online and have a small LinkedIn presence.</w:t>
+        <w:t xml:space="preserve"> the same industries and keywords, plus revenue and founding-year filters. Apollo also finds brands that sell mostly online and have a small LinkedIn presence.</w:t>
       </w:r>
     </w:p>
     <w:p>
@@ -1127,8 +1764,680 @@
       </w:pPr>
       <w:r>
         <w:rPr/>
-        <w:t xml:space="preserve">Other Sources Worth Trying</w:t>
-      </w:r>
+        <w:t xml:space="preserve">Other Ways to Find Targets</w:t>
+      </w:r>
+    </w:p>
+    <w:p>
+      <w:r>
+        <w:rPr/>
+        <w:t xml:space="preserve">Beyond Sales Navigator and Apollo, we looked at two ideas of our own: companies that already import, and companies close to launching a new product. These are the sources, what they cost, and how we'd use them.</w:t>
+      </w:r>
+    </w:p>
+    <w:tbl>
+      <w:tblPr>
+        <w:tblW w:w="9880" w:type="dxa"/>
+        <w:tblBorders>
+          <w:top w:val="single" w:sz="4" w:space="0" w:color="A6A6A6"/>
+          <w:left w:val="single" w:sz="4" w:space="0" w:color="A6A6A6"/>
+          <w:bottom w:val="single" w:sz="4" w:space="0" w:color="A6A6A6"/>
+          <w:right w:val="single" w:sz="4" w:space="0" w:color="A6A6A6"/>
+          <w:insideH w:val="single" w:sz="4" w:space="0" w:color="A6A6A6"/>
+          <w:insideV w:val="single" w:sz="4" w:space="0" w:color="A6A6A6"/>
+        </w:tblBorders>
+        <w:tblLayout w:type="fixed"/>
+        <w:tblCellMar>
+          <w:top w:w="60" w:type="dxa"/>
+          <w:left w:w="100" w:type="dxa"/>
+          <w:bottom w:w="60" w:type="dxa"/>
+          <w:right w:w="100" w:type="dxa"/>
+        </w:tblCellMar>
+      </w:tblPr>
+      <w:tblGrid>
+        <w:gridCol w:w="1700"/>
+        <w:gridCol w:w="3700"/>
+        <w:gridCol w:w="2400"/>
+        <w:gridCol w:w="2080"/>
+      </w:tblGrid>
+      <w:tr>
+        <w:trPr>
+          <w:tblHeader/>
+        </w:trPr>
+        <w:tc>
+          <w:tcPr>
+            <w:tcW w:w="1700" w:type="dxa"/>
+            <w:shd w:val="clear" w:color="auto" w:fill="1F497D"/>
+          </w:tcPr>
+          <w:p>
+            <w:pPr>
+              <w:spacing w:before="0" w:after="40"/>
+              <w:jc w:val="left"/>
+            </w:pPr>
+            <w:r>
+              <w:rPr>
+                <w:b w:val="1"/>
+                <w:bCs w:val="1"/>
+                <w:color w:val="FFFFFF"/>
+                <w:sz w:val="20"/>
+                <w:szCs w:val="20"/>
+              </w:rPr>
+              <w:t xml:space="preserve">Source</w:t>
+            </w:r>
+          </w:p>
+        </w:tc>
+        <w:tc>
+          <w:tcPr>
+            <w:tcW w:w="3700" w:type="dxa"/>
+            <w:shd w:val="clear" w:color="auto" w:fill="1F497D"/>
+          </w:tcPr>
+          <w:p>
+            <w:pPr>
+              <w:spacing w:before="0" w:after="40"/>
+              <w:jc w:val="left"/>
+            </w:pPr>
+            <w:r>
+              <w:rPr>
+                <w:b w:val="1"/>
+                <w:bCs w:val="1"/>
+                <w:color w:val="FFFFFF"/>
+                <w:sz w:val="20"/>
+                <w:szCs w:val="20"/>
+              </w:rPr>
+              <w:t xml:space="preserve">What it gives</w:t>
+            </w:r>
+          </w:p>
+        </w:tc>
+        <w:tc>
+          <w:tcPr>
+            <w:tcW w:w="2400" w:type="dxa"/>
+            <w:shd w:val="clear" w:color="auto" w:fill="1F497D"/>
+          </w:tcPr>
+          <w:p>
+            <w:pPr>
+              <w:spacing w:before="0" w:after="40"/>
+              <w:jc w:val="left"/>
+            </w:pPr>
+            <w:r>
+              <w:rPr>
+                <w:b w:val="1"/>
+                <w:bCs w:val="1"/>
+                <w:color w:val="FFFFFF"/>
+                <w:sz w:val="20"/>
+                <w:szCs w:val="20"/>
+              </w:rPr>
+              <w:t xml:space="preserve">Cost</w:t>
+            </w:r>
+          </w:p>
+        </w:tc>
+        <w:tc>
+          <w:tcPr>
+            <w:tcW w:w="2080" w:type="dxa"/>
+            <w:shd w:val="clear" w:color="auto" w:fill="1F497D"/>
+          </w:tcPr>
+          <w:p>
+            <w:pPr>
+              <w:spacing w:before="0" w:after="40"/>
+              <w:jc w:val="left"/>
+            </w:pPr>
+            <w:r>
+              <w:rPr>
+                <w:b w:val="1"/>
+                <w:bCs w:val="1"/>
+                <w:color w:val="FFFFFF"/>
+                <w:sz w:val="20"/>
+                <w:szCs w:val="20"/>
+              </w:rPr>
+              <w:t xml:space="preserve">Link</w:t>
+            </w:r>
+          </w:p>
+        </w:tc>
+      </w:tr>
+      <w:tr>
+        <w:tc>
+          <w:tcPr>
+            <w:tcW w:w="1700" w:type="dxa"/>
+          </w:tcPr>
+          <w:p>
+            <w:pPr>
+              <w:spacing w:before="0" w:after="40"/>
+              <w:jc w:val="left"/>
+            </w:pPr>
+            <w:r>
+              <w:rPr>
+                <w:sz w:val="20"/>
+                <w:szCs w:val="20"/>
+              </w:rPr>
+              <w:t xml:space="preserve">ImportYeti</w:t>
+            </w:r>
+          </w:p>
+        </w:tc>
+        <w:tc>
+          <w:tcPr>
+            <w:tcW w:w="3700" w:type="dxa"/>
+          </w:tcPr>
+          <w:p>
+            <w:pPr>
+              <w:spacing w:before="0" w:after="40"/>
+              <w:jc w:val="left"/>
+            </w:pPr>
+            <w:r>
+              <w:rPr>
+                <w:sz w:val="20"/>
+                <w:szCs w:val="20"/>
+              </w:rPr>
+              <w:t xml:space="preserve">US import records (bills of lading) since 2015: which US company imports what, from which supplier and country</w:t>
+            </w:r>
+          </w:p>
+        </w:tc>
+        <w:tc>
+          <w:tcPr>
+            <w:tcW w:w="2400" w:type="dxa"/>
+          </w:tcPr>
+          <w:p>
+            <w:pPr>
+              <w:spacing w:before="0" w:after="40"/>
+              <w:jc w:val="left"/>
+            </w:pPr>
+            <w:r>
+              <w:rPr>
+                <w:sz w:val="20"/>
+                <w:szCs w:val="20"/>
+              </w:rPr>
+              <w:t xml:space="preserve">Free search; downloads need a paid plan (prices differ across their pages, from about $50/month)</w:t>
+            </w:r>
+          </w:p>
+        </w:tc>
+        <w:tc>
+          <w:tcPr>
+            <w:tcW w:w="2080" w:type="dxa"/>
+          </w:tcPr>
+          <w:p>
+            <w:pPr>
+              <w:spacing w:before="0" w:after="40"/>
+              <w:jc w:val="left"/>
+            </w:pPr>
+            <w:hyperlink r:id="rIdL1">
+              <w:r>
+                <w:rPr>
+                  <w:sz w:val="20"/>
+                  <w:szCs w:val="20"/>
+                  <w:color w:val="1155CC"/>
+                  <w:u w:val="single"/>
+                </w:rPr>
+                <w:t xml:space="preserve">https://www.importyeti.com/</w:t>
+              </w:r>
+            </w:hyperlink>
+          </w:p>
+        </w:tc>
+      </w:tr>
+      <w:tr>
+        <w:tc>
+          <w:tcPr>
+            <w:tcW w:w="1700" w:type="dxa"/>
+          </w:tcPr>
+          <w:p>
+            <w:pPr>
+              <w:spacing w:before="0" w:after="40"/>
+              <w:jc w:val="left"/>
+            </w:pPr>
+            <w:r>
+              <w:rPr>
+                <w:sz w:val="20"/>
+                <w:szCs w:val="20"/>
+              </w:rPr>
+              <w:t xml:space="preserve">ImportGenius</w:t>
+            </w:r>
+          </w:p>
+        </w:tc>
+        <w:tc>
+          <w:tcPr>
+            <w:tcW w:w="3700" w:type="dxa"/>
+          </w:tcPr>
+          <w:p>
+            <w:pPr>
+              <w:spacing w:before="0" w:after="40"/>
+              <w:jc w:val="left"/>
+            </w:pPr>
+            <w:r>
+              <w:rPr>
+                <w:sz w:val="20"/>
+                <w:szCs w:val="20"/>
+              </w:rPr>
+              <w:t xml:space="preserve">The same type of US customs data, with more search and export tools</w:t>
+            </w:r>
+          </w:p>
+        </w:tc>
+        <w:tc>
+          <w:tcPr>
+            <w:tcW w:w="2400" w:type="dxa"/>
+          </w:tcPr>
+          <w:p>
+            <w:pPr>
+              <w:spacing w:before="0" w:after="40"/>
+              <w:jc w:val="left"/>
+            </w:pPr>
+            <w:r>
+              <w:rPr>
+                <w:sz w:val="20"/>
+                <w:szCs w:val="20"/>
+              </w:rPr>
+              <w:t xml:space="preserve">Paid subscription. Capterra lists about $125-399 per user per month; to confirm</w:t>
+            </w:r>
+          </w:p>
+        </w:tc>
+        <w:tc>
+          <w:tcPr>
+            <w:tcW w:w="2080" w:type="dxa"/>
+          </w:tcPr>
+          <w:p>
+            <w:pPr>
+              <w:spacing w:before="0" w:after="40"/>
+              <w:jc w:val="left"/>
+            </w:pPr>
+            <w:hyperlink r:id="rIdL2">
+              <w:r>
+                <w:rPr>
+                  <w:sz w:val="20"/>
+                  <w:szCs w:val="20"/>
+                  <w:color w:val="1155CC"/>
+                  <w:u w:val="single"/>
+                </w:rPr>
+                <w:t xml:space="preserve">https://www.importgenius.com/how-it-works/our-datasets/us-imports</w:t>
+              </w:r>
+            </w:hyperlink>
+          </w:p>
+        </w:tc>
+      </w:tr>
+      <w:tr>
+        <w:tc>
+          <w:tcPr>
+            <w:tcW w:w="1700" w:type="dxa"/>
+          </w:tcPr>
+          <w:p>
+            <w:pPr>
+              <w:spacing w:before="0" w:after="40"/>
+              <w:jc w:val="left"/>
+            </w:pPr>
+            <w:r>
+              <w:rPr>
+                <w:sz w:val="20"/>
+                <w:szCs w:val="20"/>
+              </w:rPr>
+              <w:t xml:space="preserve">FDA 510(k) database</w:t>
+            </w:r>
+          </w:p>
+        </w:tc>
+        <w:tc>
+          <w:tcPr>
+            <w:tcW w:w="3700" w:type="dxa"/>
+          </w:tcPr>
+          <w:p>
+            <w:pPr>
+              <w:spacing w:before="0" w:after="40"/>
+              <w:jc w:val="left"/>
+            </w:pPr>
+            <w:r>
+              <w:rPr>
+                <w:sz w:val="20"/>
+                <w:szCs w:val="20"/>
+              </w:rPr>
+              <w:t xml:space="preserve">Medical devices recently cleared for sale, with the company name and date</w:t>
+            </w:r>
+          </w:p>
+        </w:tc>
+        <w:tc>
+          <w:tcPr>
+            <w:tcW w:w="2400" w:type="dxa"/>
+          </w:tcPr>
+          <w:p>
+            <w:pPr>
+              <w:spacing w:before="0" w:after="40"/>
+              <w:jc w:val="left"/>
+            </w:pPr>
+            <w:r>
+              <w:rPr>
+                <w:sz w:val="20"/>
+                <w:szCs w:val="20"/>
+              </w:rPr>
+              <w:t xml:space="preserve">Free</w:t>
+            </w:r>
+          </w:p>
+        </w:tc>
+        <w:tc>
+          <w:tcPr>
+            <w:tcW w:w="2080" w:type="dxa"/>
+          </w:tcPr>
+          <w:p>
+            <w:pPr>
+              <w:spacing w:before="0" w:after="40"/>
+              <w:jc w:val="left"/>
+            </w:pPr>
+            <w:hyperlink r:id="rIdL3">
+              <w:r>
+                <w:rPr>
+                  <w:sz w:val="20"/>
+                  <w:szCs w:val="20"/>
+                  <w:color w:val="1155CC"/>
+                  <w:u w:val="single"/>
+                </w:rPr>
+                <w:t xml:space="preserve">https://www.accessdata.fda.gov/scripts/cdrh/cfdocs/cfpmn/pmn.cfm</w:t>
+              </w:r>
+            </w:hyperlink>
+          </w:p>
+        </w:tc>
+      </w:tr>
+      <w:tr>
+        <w:tc>
+          <w:tcPr>
+            <w:tcW w:w="1700" w:type="dxa"/>
+          </w:tcPr>
+          <w:p>
+            <w:pPr>
+              <w:spacing w:before="0" w:after="40"/>
+              <w:jc w:val="left"/>
+            </w:pPr>
+            <w:r>
+              <w:rPr>
+                <w:sz w:val="20"/>
+                <w:szCs w:val="20"/>
+              </w:rPr>
+              <w:t xml:space="preserve">FCC ID search</w:t>
+            </w:r>
+          </w:p>
+        </w:tc>
+        <w:tc>
+          <w:tcPr>
+            <w:tcW w:w="3700" w:type="dxa"/>
+          </w:tcPr>
+          <w:p>
+            <w:pPr>
+              <w:spacing w:before="0" w:after="40"/>
+              <w:jc w:val="left"/>
+            </w:pPr>
+            <w:r>
+              <w:rPr>
+                <w:sz w:val="20"/>
+                <w:szCs w:val="20"/>
+              </w:rPr>
+              <w:t xml:space="preserve">New authorizations for products with radios (Wi-Fi, Bluetooth, cellular), which must be approved before they're sold in the US</w:t>
+            </w:r>
+          </w:p>
+        </w:tc>
+        <w:tc>
+          <w:tcPr>
+            <w:tcW w:w="2400" w:type="dxa"/>
+          </w:tcPr>
+          <w:p>
+            <w:pPr>
+              <w:spacing w:before="0" w:after="40"/>
+              <w:jc w:val="left"/>
+            </w:pPr>
+            <w:r>
+              <w:rPr>
+                <w:sz w:val="20"/>
+                <w:szCs w:val="20"/>
+              </w:rPr>
+              <w:t xml:space="preserve">Free</w:t>
+            </w:r>
+          </w:p>
+        </w:tc>
+        <w:tc>
+          <w:tcPr>
+            <w:tcW w:w="2080" w:type="dxa"/>
+          </w:tcPr>
+          <w:p>
+            <w:pPr>
+              <w:spacing w:before="0" w:after="40"/>
+              <w:jc w:val="left"/>
+            </w:pPr>
+            <w:hyperlink r:id="rIdL4">
+              <w:r>
+                <w:rPr>
+                  <w:sz w:val="20"/>
+                  <w:szCs w:val="20"/>
+                  <w:color w:val="1155CC"/>
+                  <w:u w:val="single"/>
+                </w:rPr>
+                <w:t xml:space="preserve">https://www.fcc.gov/oet/ea/fccid</w:t>
+              </w:r>
+            </w:hyperlink>
+          </w:p>
+        </w:tc>
+      </w:tr>
+      <w:tr>
+        <w:tc>
+          <w:tcPr>
+            <w:tcW w:w="1700" w:type="dxa"/>
+          </w:tcPr>
+          <w:p>
+            <w:pPr>
+              <w:spacing w:before="0" w:after="40"/>
+              <w:jc w:val="left"/>
+            </w:pPr>
+            <w:r>
+              <w:rPr>
+                <w:sz w:val="20"/>
+                <w:szCs w:val="20"/>
+              </w:rPr>
+              <w:t xml:space="preserve">Kickstarter and Indiegogo</w:t>
+            </w:r>
+          </w:p>
+        </w:tc>
+        <w:tc>
+          <w:tcPr>
+            <w:tcW w:w="3700" w:type="dxa"/>
+          </w:tcPr>
+          <w:p>
+            <w:pPr>
+              <w:spacing w:before="0" w:after="40"/>
+              <w:jc w:val="left"/>
+            </w:pPr>
+            <w:r>
+              <w:rPr>
+                <w:sz w:val="20"/>
+                <w:szCs w:val="20"/>
+              </w:rPr>
+              <w:t xml:space="preserve">Hardware projects that hit their funding goal and now need to be manufactured</w:t>
+            </w:r>
+          </w:p>
+        </w:tc>
+        <w:tc>
+          <w:tcPr>
+            <w:tcW w:w="2400" w:type="dxa"/>
+          </w:tcPr>
+          <w:p>
+            <w:pPr>
+              <w:spacing w:before="0" w:after="40"/>
+              <w:jc w:val="left"/>
+            </w:pPr>
+            <w:r>
+              <w:rPr>
+                <w:sz w:val="20"/>
+                <w:szCs w:val="20"/>
+              </w:rPr>
+              <w:t xml:space="preserve">Free</w:t>
+            </w:r>
+          </w:p>
+        </w:tc>
+        <w:tc>
+          <w:tcPr>
+            <w:tcW w:w="2080" w:type="dxa"/>
+          </w:tcPr>
+          <w:p>
+            <w:pPr>
+              <w:spacing w:before="0" w:after="40"/>
+              <w:jc w:val="left"/>
+            </w:pPr>
+            <w:hyperlink r:id="rIdL5">
+              <w:r>
+                <w:rPr>
+                  <w:sz w:val="20"/>
+                  <w:szCs w:val="20"/>
+                  <w:color w:val="1155CC"/>
+                  <w:u w:val="single"/>
+                </w:rPr>
+                <w:t xml:space="preserve">https://www.kickstarter.com/</w:t>
+              </w:r>
+            </w:hyperlink>
+          </w:p>
+        </w:tc>
+      </w:tr>
+      <w:tr>
+        <w:tc>
+          <w:tcPr>
+            <w:tcW w:w="1700" w:type="dxa"/>
+          </w:tcPr>
+          <w:p>
+            <w:pPr>
+              <w:spacing w:before="0" w:after="40"/>
+              <w:jc w:val="left"/>
+            </w:pPr>
+            <w:r>
+              <w:rPr>
+                <w:sz w:val="20"/>
+                <w:szCs w:val="20"/>
+              </w:rPr>
+              <w:t xml:space="preserve">Trade show exhibitor lists</w:t>
+            </w:r>
+          </w:p>
+        </w:tc>
+        <w:tc>
+          <w:tcPr>
+            <w:tcW w:w="3700" w:type="dxa"/>
+          </w:tcPr>
+          <w:p>
+            <w:pPr>
+              <w:spacing w:before="0" w:after="40"/>
+              <w:jc w:val="left"/>
+            </w:pPr>
+            <w:r>
+              <w:rPr>
+                <w:sz w:val="20"/>
+                <w:szCs w:val="20"/>
+              </w:rPr>
+              <w:t xml:space="preserve">Brands showing new products (for example National Hardware Show, Global Pet Expo, ICAST for fishing)</w:t>
+            </w:r>
+          </w:p>
+        </w:tc>
+        <w:tc>
+          <w:tcPr>
+            <w:tcW w:w="2400" w:type="dxa"/>
+          </w:tcPr>
+          <w:p>
+            <w:pPr>
+              <w:spacing w:before="0" w:after="40"/>
+              <w:jc w:val="left"/>
+            </w:pPr>
+            <w:r>
+              <w:rPr>
+                <w:sz w:val="20"/>
+                <w:szCs w:val="20"/>
+              </w:rPr>
+              <w:t xml:space="preserve">Usually free online</w:t>
+            </w:r>
+          </w:p>
+        </w:tc>
+        <w:tc>
+          <w:tcPr>
+            <w:tcW w:w="2080" w:type="dxa"/>
+          </w:tcPr>
+          <w:p>
+            <w:pPr>
+              <w:spacing w:before="0" w:after="40"/>
+              <w:jc w:val="left"/>
+            </w:pPr>
+            <w:r>
+              <w:rPr>
+                <w:sz w:val="20"/>
+                <w:szCs w:val="20"/>
+              </w:rPr>
+              <w:t xml:space="preserve">Each show's website</w:t>
+            </w:r>
+          </w:p>
+        </w:tc>
+      </w:tr>
+      <w:tr>
+        <w:tc>
+          <w:tcPr>
+            <w:tcW w:w="1700" w:type="dxa"/>
+          </w:tcPr>
+          <w:p>
+            <w:pPr>
+              <w:spacing w:before="0" w:after="40"/>
+              <w:jc w:val="left"/>
+            </w:pPr>
+            <w:r>
+              <w:rPr>
+                <w:sz w:val="20"/>
+                <w:szCs w:val="20"/>
+              </w:rPr>
+              <w:t xml:space="preserve">MFG.com</w:t>
+            </w:r>
+          </w:p>
+        </w:tc>
+        <w:tc>
+          <w:tcPr>
+            <w:tcW w:w="3700" w:type="dxa"/>
+          </w:tcPr>
+          <w:p>
+            <w:pPr>
+              <w:spacing w:before="0" w:after="40"/>
+              <w:jc w:val="left"/>
+            </w:pPr>
+            <w:r>
+              <w:rPr>
+                <w:sz w:val="20"/>
+                <w:szCs w:val="20"/>
+              </w:rPr>
+              <w:t xml:space="preserve">Buyers posting requests for quotes on manufacturing jobs</w:t>
+            </w:r>
+          </w:p>
+        </w:tc>
+        <w:tc>
+          <w:tcPr>
+            <w:tcW w:w="2400" w:type="dxa"/>
+          </w:tcPr>
+          <w:p>
+            <w:pPr>
+              <w:spacing w:before="0" w:after="40"/>
+              <w:jc w:val="left"/>
+            </w:pPr>
+            <w:r>
+              <w:rPr>
+                <w:sz w:val="20"/>
+                <w:szCs w:val="20"/>
+              </w:rPr>
+              <w:t xml:space="preserve">Suppliers pay per request or for a Premium plan; price not public</w:t>
+            </w:r>
+          </w:p>
+        </w:tc>
+        <w:tc>
+          <w:tcPr>
+            <w:tcW w:w="2080" w:type="dxa"/>
+          </w:tcPr>
+          <w:p>
+            <w:pPr>
+              <w:spacing w:before="0" w:after="40"/>
+              <w:jc w:val="left"/>
+            </w:pPr>
+            <w:hyperlink r:id="rIdL6">
+              <w:r>
+                <w:rPr>
+                  <w:sz w:val="20"/>
+                  <w:szCs w:val="20"/>
+                  <w:color w:val="1155CC"/>
+                  <w:u w:val="single"/>
+                </w:rPr>
+                <w:t xml:space="preserve">https://www.mfg.com/</w:t>
+              </w:r>
+            </w:hyperlink>
+          </w:p>
+        </w:tc>
+      </w:tr>
+    </w:tbl>
+    <w:p>
+      <w:pPr>
+        <w:spacing w:before="0" w:after="0"/>
+      </w:pPr>
     </w:p>
     <w:p>
       <w:pPr>
@@ -1136,19 +2445,13 @@
       </w:pPr>
       <w:r>
         <w:rPr/>
-        <w:t xml:space="preserve">Companies that already import (Kaity's ImportGenius idea)</w:t>
-      </w:r>
-    </w:p>
-    <w:p>
-      <w:r>
-        <w:rPr/>
-        <w:t xml:space="preserve">ImportGenius sells US customs import records (bills of lading). They show which US company imported what, from which supplier and country, and when. We could use them to find brands that import finished products similar to what Steiner makes (lights, fans, speakers, chargers, outdoor products, metal and molded parts), then offer Steiner as an alternative or second source. Capterra lists plans from about $125 to $399 per user per month; the client should confirm the price with ImportGenius. ImportYeti is described as offering free searches of the same type of US customs data, so we can test the idea there first (to confirm).</w:t>
-      </w:r>
-    </w:p>
-    <w:p>
-      <w:r>
-        <w:rPr/>
-        <w:t xml:space="preserve">Free signals in our own tools: job posts for sourcing roles that mention Asia or overseas suppliers, and company descriptions that mention “imported” or “designed in the USA”.</w:t>
+        <w:t xml:space="preserve">Companies that already import</w:t>
+      </w:r>
+    </w:p>
+    <w:p>
+      <w:r>
+        <w:rPr/>
+        <w:t xml:space="preserve">How it would work: we search the import data by product (for example LED lights, fans, speakers, chargers, outdoor products, metal or molded parts) and pick US brands of 11-200 employees that import finished products. We then find their owners and sourcing people on LinkedIn and reach them with the same messages, adding a line about production options closer to home. We test this with the free ImportYeti search first; if it works, a paid plan saves time.</w:t>
       </w:r>
     </w:p>
     <w:p>
@@ -1163,7 +2466,7 @@
           <w:sz w:val="22"/>
           <w:szCs w:val="22"/>
         </w:rPr>
-        <w:t xml:space="preserve">What the past replies tell us: several leads were looking at moving production or finding a second source (Seal Shield: “exploring re/near shoring some asia based products”), but one meeting failed because the company already imported directly at a lower price. So the pitch is not “cheaper than your factory”. It's one partner that owns the engineering, factories and quality, with onshore, nearshore and offshore options.</w:t>
+        <w:t xml:space="preserve">Past replies support this: Seal Shield was “exploring re/near shoring some asia based products”. But one meeting failed because the company already imported directly at a lower price. So the pitch is not “cheaper than your factory”: it's one partner that owns the engineering, factories and quality, with onshore, nearshore and offshore options.</w:t>
       </w:r>
     </w:p>
     <w:p>
@@ -1172,7 +2475,7 @@
       </w:pPr>
       <w:r>
         <w:rPr/>
-        <w:t xml:space="preserve">Pre-launch products and FDA approval (Kaity's idea)</w:t>
+        <w:t xml:space="preserve">Pre-launch products and FDA approval</w:t>
       </w:r>
     </w:p>
     <w:p>
@@ -1199,7 +2502,7 @@
       </w:r>
       <w:r>
         <w:rPr/>
-        <w:t xml:space="preserve"> most Class II devices need 510(k) clearance before they can be sold, new types of devices go through De Novo, and high-risk (Class III) devices need PMA approval. Most Class I devices are exempt.</w:t>
+        <w:t xml:space="preserve"> most Class II devices need 510(k) clearance, new types of devices go through De Novo, and high-risk (Class III) devices need PMA approval. Most Class I devices are exempt.</w:t>
       </w:r>
     </w:p>
     <w:p>
@@ -1212,15 +2515,8 @@
         <w:ind w:left="720" w:hanging="360"/>
       </w:pPr>
       <w:r>
-        <w:rPr>
-          <w:b w:val="1"/>
-          <w:bCs w:val="1"/>
-        </w:rPr>
-        <w:t xml:space="preserve">Laser products and some other radiation-emitting electronics:</w:t>
-      </w:r>
-      <w:r>
-        <w:rPr/>
-        <w:t xml:space="preserve"> they must meet FDA performance standards and be reported to the FDA.</w:t>
+        <w:rPr/>
+        <w:t xml:space="preserve">Laser products and some other radiation-emitting electronics must meet FDA performance standards and be reported to the FDA.</w:t>
       </w:r>
     </w:p>
     <w:p>
@@ -1234,13 +2530,13 @@
       </w:pPr>
       <w:r>
         <w:rPr/>
-        <w:t xml:space="preserve">Drugs and biologics need approval, but they aren't a fit for Steiner. Most foods and cosmetics don't need FDA approval before launch, so they give no pre-launch signal.</w:t>
-      </w:r>
-    </w:p>
-    <w:p>
-      <w:r>
-        <w:rPr/>
-        <w:t xml:space="preserve">How to find pre-launch companies: the FDA's 510(k) database is free and searchable by decision date. A clearance in the last 6-12 months usually means the device is about to be built and sold. We can filter for small companies (11-50) with electro-mechanical devices (monitors, carts, enclosures, handheld devices), which fit Steiner's capabilities.</w:t>
+        <w:t xml:space="preserve">Drugs and biologics need approval but aren't a fit for Steiner. Most foods and cosmetics need no FDA approval before launch.</w:t>
+      </w:r>
+    </w:p>
+    <w:p>
+      <w:r>
+        <w:rPr/>
+        <w:t xml:space="preserve">How to use it: a 510(k) clearance in the last 6-12 months usually means a device is about to be built and sold. We can filter for small companies (11-50) with electro-mechanical devices (monitors, carts, enclosures, handheld devices).</w:t>
       </w:r>
     </w:p>
     <w:p>
@@ -1255,13 +2551,28 @@
           <w:sz w:val="22"/>
           <w:szCs w:val="22"/>
         </w:rPr>
-        <w:t xml:space="preserve">Things to consider: medical is the only real FDA match for Steiner, and the client sees medical projects as low value. Since February 2026, contract manufacturers of finished medical devices must follow the FDA's quality system rule, which is built on ISO 13485. Steiner holds ISO 9001:2015, and one past lead turned us down over certificates. So we suggest this only as a small test, and only for parts and sub-assemblies, unless Steiner confirms it can take on finished devices.</w:t>
-      </w:r>
-    </w:p>
-    <w:p>
-      <w:r>
-        <w:rPr/>
-        <w:t xml:space="preserve">Other pre-launch signals that fit Steiner better, all free:</w:t>
+        <w:t xml:space="preserve">Things to consider: medical is the only real FDA match, and the client sees medical as low value. Since February 2026, contract manufacturers of finished medical devices must follow the FDA's quality system rule, built on ISO 13485. Steiner holds ISO 9001:2015, and one past lead turned us down over certificates. So we suggest it only as a small test for parts and sub-assemblies, unless Steiner can take on finished devices. The FCC, crowdfunding and trade show sources above give the same pre-launch signal for consumer and electronic products, which fit Steiner better.</w:t>
+      </w:r>
+    </w:p>
+    <w:p>
+      <w:pPr>
+        <w:pStyle w:val="Heading2"/>
+      </w:pPr>
+      <w:r>
+        <w:rPr/>
+        <w:t xml:space="preserve">The Strategy</w:t>
+      </w:r>
+    </w:p>
+    <w:p>
+      <w:r>
+        <w:rPr/>
+        <w:t xml:space="preserve">We send connection requests from Tom's profile, followed by four LinkedIn messages. Each message comes from a different angle, so if one doesn't land, the next one might. After four, we stop. Josh's profile can test target 3 in parallel.</w:t>
+      </w:r>
+    </w:p>
+    <w:p>
+      <w:r>
+        <w:rPr/>
+        <w:t xml:space="preserve">We test two versions side by side, each on half of the leads:</w:t>
       </w:r>
     </w:p>
     <w:p>
@@ -1278,11 +2589,11 @@
           <w:b w:val="1"/>
           <w:bCs w:val="1"/>
         </w:rPr>
-        <w:t xml:space="preserve">FCC authorizations:</w:t>
-      </w:r>
-      <w:r>
-        <w:rPr/>
-        <w:t xml:space="preserve"> products with radios (Wi-Fi, Bluetooth, cellular) need FCC certification before they are sold in the US, and each grant is public. New grants show companies about to launch a product, including small US brands.</w:t>
+        <w:t xml:space="preserve">BizzBee version:</w:t>
+      </w:r>
+      <w:r>
+        <w:rPr/>
+        <w:t xml:space="preserve"> built on the Sweet Leads framework. Duality, empathy, credibility, then free value. It starts a conversation before talking about Steiner.</w:t>
       </w:r>
     </w:p>
     <w:p>
@@ -1299,90 +2610,6 @@
           <w:b w:val="1"/>
           <w:bCs w:val="1"/>
         </w:rPr>
-        <w:t xml:space="preserve">Crowdfunded hardware:</w:t>
-      </w:r>
-      <w:r>
-        <w:rPr/>
-        <w:t xml:space="preserve"> products that hit their Kickstarter or Indiegogo goal must now be manufactured, often by a team that has never done it before.</w:t>
-      </w:r>
-    </w:p>
-    <w:p>
-      <w:pPr>
-        <w:numPr>
-          <w:ilvl w:val="0"/>
-          <w:numId w:val="2"/>
-        </w:numPr>
-        <w:spacing w:after="0" w:before="120" w:lineRule="auto"/>
-        <w:ind w:left="720" w:hanging="360"/>
-      </w:pPr>
-      <w:r>
-        <w:rPr>
-          <w:b w:val="1"/>
-          <w:bCs w:val="1"/>
-        </w:rPr>
-        <w:t xml:space="preserve">Job posts:</w:t>
-      </w:r>
-      <w:r>
-        <w:rPr/>
-        <w:t xml:space="preserve"> brands hiring for new product development or for a first sourcing manager are about to build something new.</w:t>
-      </w:r>
-    </w:p>
-    <w:p>
-      <w:pPr>
-        <w:pStyle w:val="Heading2"/>
-      </w:pPr>
-      <w:r>
-        <w:rPr/>
-        <w:t xml:space="preserve">The Strategy</w:t>
-      </w:r>
-    </w:p>
-    <w:p>
-      <w:r>
-        <w:rPr/>
-        <w:t xml:space="preserve">We send connection requests from Tom's profile, followed by four LinkedIn messages. Each message comes from a different angle, so if one doesn't land, the next one might. After four, we stop. Josh's profile can test target 3 in parallel.</w:t>
-      </w:r>
-    </w:p>
-    <w:p>
-      <w:r>
-        <w:rPr/>
-        <w:t xml:space="preserve">We test two versions side by side, each on half of the leads:</w:t>
-      </w:r>
-    </w:p>
-    <w:p>
-      <w:pPr>
-        <w:numPr>
-          <w:ilvl w:val="0"/>
-          <w:numId w:val="2"/>
-        </w:numPr>
-        <w:spacing w:after="0" w:before="120" w:lineRule="auto"/>
-        <w:ind w:left="720" w:hanging="360"/>
-      </w:pPr>
-      <w:r>
-        <w:rPr>
-          <w:b w:val="1"/>
-          <w:bCs w:val="1"/>
-        </w:rPr>
-        <w:t xml:space="preserve">BizzBee version:</w:t>
-      </w:r>
-      <w:r>
-        <w:rPr/>
-        <w:t xml:space="preserve"> built on the Sweet Leads framework. Duality, empathy, credibility, then free value. It starts a conversation before talking about Steiner.</w:t>
-      </w:r>
-    </w:p>
-    <w:p>
-      <w:pPr>
-        <w:numPr>
-          <w:ilvl w:val="0"/>
-          <w:numId w:val="2"/>
-        </w:numPr>
-        <w:spacing w:after="0" w:before="120" w:lineRule="auto"/>
-        <w:ind w:left="720" w:hanging="360"/>
-      </w:pPr>
-      <w:r>
-        <w:rPr>
-          <w:b w:val="1"/>
-          <w:bCs w:val="1"/>
-        </w:rPr>
         <w:t xml:space="preserve">Direct version:</w:t>
       </w:r>
       <w:r>
@@ -1393,13 +2620,13 @@
     <w:p>
       <w:r>
         <w:rPr/>
-        <w:t xml:space="preserve">New angle compared with the past messages: we speak to them as a brand with a product, not as a manufacturer. We use Steiner's own language (“your product redesigned”, “your idea brought to life”) and real case studies, and we drop the words that didn't work: “contract manufacturing”, quarterly roadmaps, and “free consultation”. The free offer becomes concrete: send a photo, drawing or link of a product, and Steiner's engineers come back with ideas and a rough quote.</w:t>
-      </w:r>
-    </w:p>
-    <w:p>
-      <w:r>
-        <w:rPr/>
-        <w:t xml:space="preserve">Email: after 13,439 emails with no interested replies, we suggest email only as a small test (a few hundred contacts) with the short emails below, sent one week after the LinkedIn sequence to people who didn't accept or didn't reply. The campaign uses variables such as </w:t>
+        <w:t xml:space="preserve">New angle compared with the past messages: we speak to them as a brand with a product, not as a manufacturer. We use Steiner's own language (“your product redesigned”, “your idea brought to life”) and real case studies, and drop what didn't work: “contract manufacturing”, quarterly roadmaps and the general “free consultation”. The free offer becomes concrete: send a photo, drawing or link of a product, and Steiner's engineers come back with ideas and a rough quote.</w:t>
+      </w:r>
+    </w:p>
+    <w:p>
+      <w:r>
+        <w:rPr/>
+        <w:t xml:space="preserve">Email: given the past results, we suggest email only as a small test (a few hundred contacts), sent one week after the LinkedIn sequence to people who didn't accept or didn't reply. The campaign uses variables such as </w:t>
       </w:r>
       <w:r>
         <w:rPr>
@@ -1618,7 +2845,7 @@
       </w:pPr>
       <w:r>
         <w:rPr/>
-        <w:t xml:space="preserve">Target 1 — Consumer and Outdoor Product Brands</w:t>
+        <w:t xml:space="preserve">Target 1 — Consumer and Retail Product Brands</w:t>
       </w:r>
     </w:p>
     <w:p>
@@ -1810,7 +3037,7 @@
           <w:i w:val="1"/>
           <w:iCs w:val="1"/>
         </w:rPr>
-        <w:t xml:space="preserve">. I'm Tom from Steiner Enterprises in Lafayette, Indiana. We design, source and build products for brands, from a rough idea to a retail-ready box. Is there a product in your line you'd like to make better or for less?</w:t>
+        <w:t xml:space="preserve">. I'm Tom from Steiner Enterprises in Lafayette, Indiana. We design, source and build products for brands, from a rough idea to a finished, packaged product. Is there a product in your line you'd like to make better or for less?</w:t>
       </w:r>
     </w:p>
     <w:p>
@@ -1825,7 +3052,7 @@
           <w:sz w:val="22"/>
           <w:szCs w:val="22"/>
         </w:rPr>
-        <w:t xml:space="preserve">Response suggestion: whatever side they pick, ask why, or which product they're thinking of. Don't pitch yet. If they say they work with factories directly, ask what's hardest about it: lead times, quality, or minimum orders. That's the opening for the next message.</w:t>
+        <w:t xml:space="preserve">Response suggestion: whatever side they pick, ask why, or which product they're thinking of. Don't pitch yet. If they say they work with factories directly, ask what's hardest about it: lead times, quality or minimum orders. That's the opening for the next message.</w:t>
       </w:r>
     </w:p>
     <w:p>
@@ -2015,7 +3242,7 @@
           <w:sz w:val="22"/>
           <w:szCs w:val="22"/>
         </w:rPr>
-        <w:t xml:space="preserve">Response suggestion: if they name a product, ask what they'd change about it and what volume they sell. If they say everything is fine, don't push. Tell them that's good to hear and ask what's next in their line.</w:t>
+        <w:t xml:space="preserve">Response suggestion: if they name a product, ask what they'd change about it and how many they sell a year. If they say everything is fine, don't push. Tell them that's good to hear and ask what's next in their line.</w:t>
       </w:r>
     </w:p>
     <w:p>
@@ -2090,7 +3317,7 @@
           <w:i w:val="1"/>
           <w:iCs w:val="1"/>
         </w:rPr>
-        <w:t xml:space="preserve">, I jumped into questions without introducing myself. I'm Tom, President of Steiner Enterprises in Lafayette, Indiana. For over 30 years we've been the team behind other brands' products: design and engineering, sourcing, assembly and retail packaging, with onshore, nearshore and offshore production. For one customer, a new starter kit and packaging we designed dramatically improved their sales. If interested, happy to tell you more.</w:t>
+        <w:t xml:space="preserve">, I jumped into questions without introducing myself. I'm Tom, President of Steiner Enterprises in Lafayette, Indiana. For over 30 years we've been the team behind other brands' products: design and engineering, sourcing, assembly and custom packaging, with onshore, nearshore and offshore production. For one customer, we helped put together a starter kit and designed its packaging, and the new kit dramatically improved their sales. If interested, happy to tell you more.</w:t>
       </w:r>
     </w:p>
     <w:p>
@@ -2105,7 +3332,7 @@
           <w:sz w:val="22"/>
           <w:szCs w:val="22"/>
         </w:rPr>
-        <w:t xml:space="preserve">Response suggestion: if they want to know more, explain it in two or three short lines and suggest a short call with Tom. If they ask about non-consumer work, mention the RV, science-education and fleet projects. Only name clients the team has approved.</w:t>
+        <w:t xml:space="preserve">Response suggestion: if they want to know more, explain it in two or three short lines and suggest a short call with Tom. Only name clients the team has approved.</w:t>
       </w:r>
     </w:p>
     <w:p>
@@ -2130,7 +3357,7 @@
     <w:p>
       <w:r>
         <w:rPr/>
-        <w:t xml:space="preserve">The last message on LinkedIn. If they haven't responded by now, they are probably not interested, but we give them one more chance. We politely say goodbye and offer free value: a quick review of one of their products. They will either take it, or keep ignoring us, but when they next need a product redesigned or made, they will probably have Steiner in mind.</w:t>
+        <w:t xml:space="preserve">The last message on LinkedIn. If they haven't responded by now, they are probably not interested, but we give them one more chance and offer free value: a quick review of one of their products. They will either take it, or keep ignoring us, but when they next need a product redesigned or made, they will probably have Steiner in mind.</w:t>
       </w:r>
     </w:p>
     <w:p>
@@ -2163,7 +3390,7 @@
           <w:i w:val="1"/>
           <w:iCs w:val="1"/>
         </w:rPr>
-        <w:t xml:space="preserve">I guess you're busy, </w:t>
+        <w:t xml:space="preserve">Hi </w:t>
       </w:r>
       <w:r>
         <w:rPr>
@@ -2180,7 +3407,7 @@
           <w:i w:val="1"/>
           <w:iCs w:val="1"/>
         </w:rPr>
-        <w:t xml:space="preserve">, so I'll stop here. One last thing. If there's a product you'd like to improve or make for less, send me a photo, a drawing or a link. Our engineers will come back with a few ideas and a rough quote, with no commitment. Want to try it?</w:t>
+        <w:t xml:space="preserve">, one last thing from me. If there's a product you'd like to improve or make for less, send me a photo, a drawing or a link. Our engineers will come back with a few ideas and a rough quote, with no commitment. Want to try it?</w:t>
       </w:r>
     </w:p>
     <w:p>
@@ -2246,7 +3473,7 @@
       </w:r>
       <w:r>
         <w:rPr/>
-        <w:t xml:space="preserve"> don't compete on price. Ask how lead times and quality have been, and mention Steiner can be a second source or move part of it closer to home.</w:t>
+        <w:t xml:space="preserve"> don't compete on price. Ask how lead times and quality have been, and mention Steiner can be a second source, with options closer to home.</w:t>
       </w:r>
     </w:p>
     <w:p>
@@ -2332,7 +3559,7 @@
           <w:i w:val="1"/>
           <w:iCs w:val="1"/>
         </w:rPr>
-        <w:t xml:space="preserve">, it's been a while since we last talked. A lot has changed at Steiner since then: new website, new capabilities, and production options onshore, nearshore and offshore. Are you working on anything this year where a second pair of hands on design or production would help?</w:t>
+        <w:t xml:space="preserve">, it's been a while since we last talked. A lot has changed at Steiner since then: a new website, new capabilities, and production options onshore, nearshore and offshore. Are you working on anything this year where a second pair of hands on design or production would help?</w:t>
       </w:r>
     </w:p>
     <w:p>
@@ -2356,7 +3583,7 @@
       </w:pPr>
       <w:r>
         <w:rPr/>
-        <w:t xml:space="preserve">Target 1 — Consumer and Outdoor Product Brands</w:t>
+        <w:t xml:space="preserve">Target 1 — Consumer and Retail Product Brands</w:t>
       </w:r>
     </w:p>
     <w:p>
@@ -2450,7 +3677,7 @@
           <w:i w:val="1"/>
           <w:iCs w:val="1"/>
         </w:rPr>
-        <w:t xml:space="preserve">I'm Tom, President of Steiner Enterprises in Lafayette, Indiana. For over 30 years we've been the team behind other brands' products: design, sourcing, assembly and retail packaging.</w:t>
+        <w:t xml:space="preserve">I'm Tom, President of Steiner Enterprises in Lafayette, Indiana. For over 30 years we've been the team behind other brands' products: design, sourcing, assembly and custom packaging.</w:t>
       </w:r>
     </w:p>
     <w:p>
@@ -2544,7 +3771,7 @@
           <w:i w:val="1"/>
           <w:iCs w:val="1"/>
         </w:rPr>
-        <w:t xml:space="preserve"> Subject: one example / refresh at the same price</w:t>
+        <w:t xml:space="preserve"> Subject: one example / same look, better product</w:t>
       </w:r>
     </w:p>
     <w:p>
@@ -2595,7 +3822,7 @@
           <w:i w:val="1"/>
           <w:iCs w:val="1"/>
         </w:rPr>
-        <w:t xml:space="preserve">A quick example. A customer wanted their LED light to match a new product family. We kept the look, upgraded the electronics with more light output, an illuminated switch and fuse protection, and reduced the cost.</w:t>
+        <w:t xml:space="preserve">A quick example. A customer wanted their LED light to fit a new product family. We kept the look, upgraded the electronics with more light output, an illuminated switch and fuse protection, and reduced the cost.</w:t>
       </w:r>
     </w:p>
     <w:p>
@@ -2825,7 +4052,7 @@
       </w:r>
       <w:r>
         <w:rPr/>
-        <w:t xml:space="preserve"> the website mentions onshore, nearshore and offshore production. Please confirm which countries we can name in messages (the US, Mexico, Southeast Asia).</w:t>
+        <w:t xml:space="preserve"> the website mentions onshore, nearshore and offshore production. Please confirm which countries we can name (for example the US, Mexico, Southeast Asia).</w:t>
       </w:r>
     </w:p>
     <w:p>
@@ -2846,7 +4073,7 @@
       </w:r>
       <w:r>
         <w:rPr/>
-        <w:t xml:space="preserve"> which client names and case studies can we mention in messages?</w:t>
+        <w:t xml:space="preserve"> which client names and case studies can we mention?</w:t>
       </w:r>
     </w:p>
     <w:p>
@@ -2863,11 +4090,11 @@
           <w:b w:val="1"/>
           <w:bCs w:val="1"/>
         </w:rPr>
-        <w:t xml:space="preserve">Competitors of current clients:</w:t>
-      </w:r>
-      <w:r>
-        <w:rPr/>
-        <w:t xml:space="preserve"> can we approach competitors of the RV and science-education clients (targets 2 and 4)?</w:t>
+        <w:t xml:space="preserve">Science and education:</w:t>
+      </w:r>
+      <w:r>
+        <w:rPr/>
+        <w:t xml:space="preserve"> can we approach competitors of the current education clients (target 4)?</w:t>
       </w:r>
     </w:p>
     <w:p>
@@ -2926,11 +4153,11 @@
           <w:b w:val="1"/>
           <w:bCs w:val="1"/>
         </w:rPr>
-        <w:t xml:space="preserve">Paid data:</w:t>
-      </w:r>
-      <w:r>
-        <w:rPr/>
-        <w:t xml:space="preserve"> if the free tests work, would Steiner subscribe to ImportGenius for the importer list?</w:t>
+        <w:t xml:space="preserve">RVs:</w:t>
+      </w:r>
+      <w:r>
+        <w:rPr/>
+        <w:t xml:space="preserve"> kept out of this campaign until the new RV solution is ready.</w:t>
       </w:r>
     </w:p>
     <w:p>
@@ -2953,7 +4180,7 @@
       </w:pPr>
       <w:r>
         <w:rPr/>
-        <w:t xml:space="preserve">Steiner Enterprises – Report (Board, Sources, Database, LinkedIn KPIs, Email KPIs and Existing Clients tabs), the Drive folder for Steiner.</w:t>
+        <w:t xml:space="preserve">Steiner Enterprises – Report (Sources, Database, LinkedIn KPIs, Email KPIs and Existing Clients tabs) and the client documents in Steiner's Drive folder (onboarding form, ICP research, brochure, 14 case studies).</w:t>
       </w:r>
     </w:p>
     <w:p>
@@ -2966,20 +4193,6 @@
         <w:ind w:left="720" w:hanging="360"/>
       </w:pPr>
       <w:r>
-        <w:rPr/>
-        <w:t xml:space="preserve">Company Information (onboarding), ICP Research, Outreach Strategy, Steiner Overview Brochure, and 14 case studies, same folder.</w:t>
-      </w:r>
-    </w:p>
-    <w:p>
-      <w:pPr>
-        <w:numPr>
-          <w:ilvl w:val="0"/>
-          <w:numId w:val="2"/>
-        </w:numPr>
-        <w:spacing w:after="0" w:before="120" w:lineRule="auto"/>
-        <w:ind w:left="720" w:hanging="360"/>
-      </w:pPr>
-      <w:r>
         <w:rPr>
           <w:b w:val="1"/>
           <w:bCs w:val="1"/>
@@ -2990,7 +4203,7 @@
         <w:rPr/>
         <w:t xml:space="preserve"> </w:t>
       </w:r>
-      <w:hyperlink r:id="rIdL1">
+      <w:hyperlink r:id="rIdL7">
         <w:r>
           <w:rPr>
             <w:color w:val="1155CC"/>
@@ -3001,7 +4214,7 @@
       </w:hyperlink>
       <w:r>
         <w:rPr/>
-        <w:t xml:space="preserve"> (Who we are, What we do, Case studies)</w:t>
+        <w:t xml:space="preserve"> (Who we are, What we do, Industries, Case studies)</w:t>
       </w:r>
     </w:p>
     <w:p>
@@ -3018,19 +4231,19 @@
           <w:b w:val="1"/>
           <w:bCs w:val="1"/>
         </w:rPr>
-        <w:t xml:space="preserve">ImportGenius US imports:</w:t>
+        <w:t xml:space="preserve">FDA quality system rule (QMSR), effective February 2, 2026:</w:t>
       </w:r>
       <w:r>
         <w:rPr/>
         <w:t xml:space="preserve"> </w:t>
       </w:r>
-      <w:hyperlink r:id="rIdL2">
+      <w:hyperlink r:id="rIdL8">
         <w:r>
           <w:rPr>
             <w:color w:val="1155CC"/>
             <w:u w:val="single"/>
           </w:rPr>
-          <w:t xml:space="preserve">https://www.importgenius.com/how-it-works/our-datasets/us-imports</w:t>
+          <w:t xml:space="preserve">https://www.fda.gov/media/190399/download</w:t>
         </w:r>
       </w:hyperlink>
     </w:p>
@@ -3048,49 +4261,19 @@
           <w:b w:val="1"/>
           <w:bCs w:val="1"/>
         </w:rPr>
-        <w:t xml:space="preserve">FDA 510(k) clearances:</w:t>
+        <w:t xml:space="preserve">ImportGenius pricing as listed on Capterra:</w:t>
       </w:r>
       <w:r>
         <w:rPr/>
         <w:t xml:space="preserve"> </w:t>
       </w:r>
-      <w:hyperlink r:id="rIdL3">
+      <w:hyperlink r:id="rIdL9">
         <w:r>
           <w:rPr>
             <w:color w:val="1155CC"/>
             <w:u w:val="single"/>
           </w:rPr>
-          <w:t xml:space="preserve">https://www.fda.gov/medical-devices/device-approvals-denials-and-clearances/510k-clearances</w:t>
-        </w:r>
-      </w:hyperlink>
-    </w:p>
-    <w:p>
-      <w:pPr>
-        <w:numPr>
-          <w:ilvl w:val="0"/>
-          <w:numId w:val="2"/>
-        </w:numPr>
-        <w:spacing w:after="0" w:before="120" w:lineRule="auto"/>
-        <w:ind w:left="720" w:hanging="360"/>
-      </w:pPr>
-      <w:r>
-        <w:rPr>
-          <w:b w:val="1"/>
-          <w:bCs w:val="1"/>
-        </w:rPr>
-        <w:t xml:space="preserve">FCC equipment authorization search:</w:t>
-      </w:r>
-      <w:r>
-        <w:rPr/>
-        <w:t xml:space="preserve"> </w:t>
-      </w:r>
-      <w:hyperlink r:id="rIdL4">
-        <w:r>
-          <w:rPr>
-            <w:color w:val="1155CC"/>
-            <w:u w:val="single"/>
-          </w:rPr>
-          <w:t xml:space="preserve">https://www.fcc.gov/fccid</w:t>
+          <w:t xml:space="preserve">https://www.capterra.com/p/10032153/ImportGenius/reviews/</w:t>
         </w:r>
       </w:hyperlink>
     </w:p>

</xml_diff>

<commit_message>
Drop vehicle accessories, widen the science target and add prototype sources for Steiner
Co-Authored-By: Claude Opus 5.5 <noreply@anthropic.com>
Claude-Session: https://claude.ai/code/session_018AsKRCDgw5Ln2FqTPH9DBq
</commit_message>
<xml_diff>
--- a/Outreach Messages - Steiner Enterprises 2026.docx
+++ b/Outreach Messages - Steiner Enterprises 2026.docx
@@ -575,7 +575,7 @@
                 <w:sz w:val="20"/>
                 <w:szCs w:val="20"/>
               </w:rPr>
-              <w:t xml:space="preserve">Only unfinished searches and new roles (target 5)</w:t>
+              <w:t xml:space="preserve">Only unfinished searches and new roles (target 4)</w:t>
             </w:r>
           </w:p>
         </w:tc>
@@ -631,7 +631,7 @@
                 <w:sz w:val="20"/>
                 <w:szCs w:val="20"/>
               </w:rPr>
-              <w:t xml:space="preserve">Only unfinished searches and new roles (target 5)</w:t>
+              <w:t xml:space="preserve">Only unfinished searches and new roles (target 4)</w:t>
             </w:r>
           </w:p>
         </w:tc>
@@ -781,7 +781,7 @@
                 <w:sz w:val="20"/>
                 <w:szCs w:val="20"/>
               </w:rPr>
-              <w:t xml:space="preserve">Partly: measuring and control instruments, 11-500 (51 companies)</w:t>
+              <w:t xml:space="preserve">Partly: only through Measuring and Control Instrument Manufacturing (Sales Navigator, ensun and Crunchbase lists)</w:t>
             </w:r>
           </w:p>
         </w:tc>
@@ -799,7 +799,7 @@
                 <w:sz w:val="20"/>
                 <w:szCs w:val="20"/>
               </w:rPr>
-              <w:t xml:space="preserve">Target 4</w:t>
+              <w:t xml:space="preserve">Target 3, with other industries and keywords</w:t>
             </w:r>
           </w:p>
         </w:tc>
@@ -837,7 +837,7 @@
                 <w:sz w:val="20"/>
                 <w:szCs w:val="20"/>
               </w:rPr>
-              <w:t xml:space="preserve">Clients only</w:t>
+              <w:t xml:space="preserve">No: Steiner asked us to leave RVs out</w:t>
             </w:r>
           </w:p>
         </w:tc>
@@ -855,7 +855,7 @@
                 <w:sz w:val="20"/>
                 <w:szCs w:val="20"/>
               </w:rPr>
-              <w:t xml:space="preserve">Later, with the new RV solution</w:t>
+              <w:t xml:space="preserve">Later, with Steiner's new RV solution</w:t>
             </w:r>
           </w:p>
         </w:tc>
@@ -869,7 +869,7 @@
     <w:p>
       <w:r>
         <w:rPr/>
-        <w:t xml:space="preserve">Two more targets come from Steiner's dream prospects and case studies rather than the website list: vehicle accessories (target 2) and fleet and telematics hardware (target 3).</w:t>
+        <w:t xml:space="preserve">One more target comes from Steiner's dream prospects and case studies rather than the website list: fleet and telematics hardware (target 2). Vehicle parts and accessories, boats and agricultural equipment were already covered through Motor Vehicle Parts, Transportation Equipment, Shipbuilding and agricultural equipment searches, so they are not repeated.</w:t>
       </w:r>
     </w:p>
     <w:tbl>
@@ -1096,20 +1096,20 @@
                 <w:sz w:val="20"/>
                 <w:szCs w:val="20"/>
               </w:rPr>
-              <w:t xml:space="preserve">2. Vehicle accessory brands</w:t>
-            </w:r>
-          </w:p>
-          <w:p>
-            <w:pPr>
-              <w:spacing w:before="0" w:after="40"/>
-              <w:jc w:val="left"/>
-            </w:pPr>
-            <w:r>
-              <w:rPr>
-                <w:sz w:val="20"/>
-                <w:szCs w:val="20"/>
-              </w:rPr>
-              <w:t xml:space="preserve">Aftermarket automotive, off-road, powersports and marine accessories</w:t>
+              <w:t xml:space="preserve">2. Fleet, telematics and logistics hardware</w:t>
+            </w:r>
+          </w:p>
+          <w:p>
+            <w:pPr>
+              <w:spacing w:before="0" w:after="40"/>
+              <w:jc w:val="left"/>
+            </w:pPr>
+            <w:r>
+              <w:rPr>
+                <w:sz w:val="20"/>
+                <w:szCs w:val="20"/>
+              </w:rPr>
+              <w:t xml:space="preserve">GPS tracking, fleet devices, RFID and barcode hardware</w:t>
             </w:r>
           </w:p>
         </w:tc>
@@ -1127,7 +1127,7 @@
                 <w:sz w:val="20"/>
                 <w:szCs w:val="20"/>
               </w:rPr>
-              <w:t xml:space="preserve">Steiner's automotive work and hitch products; 12V case studies (voltage booster, barcode scanner, USB charger). Interested before: Mile Marker, Agile Offroad, AFCO, Dash Designs. Motor vehicle parts had the best rate (7.7%, small sample)</w:t>
+              <w:t xml:space="preserve">Dream prospects: Zonar and logistics hardware. Client: CalAmp. Case studies: voltage booster, barcode scanner, fleet tracking operator panel</w:t>
             </w:r>
           </w:p>
         </w:tc>
@@ -1145,7 +1145,7 @@
                 <w:sz w:val="20"/>
                 <w:szCs w:val="20"/>
               </w:rPr>
-              <w:t xml:space="preserve">11-200</w:t>
+              <w:t xml:space="preserve">11-500</w:t>
             </w:r>
           </w:p>
         </w:tc>
@@ -1163,7 +1163,7 @@
                 <w:sz w:val="20"/>
                 <w:szCs w:val="20"/>
               </w:rPr>
-              <w:t xml:space="preserve">Owner, President; VP/Director of Operations; Purchasing; Product Manager</w:t>
+              <w:t xml:space="preserve">VP/Director of Hardware or Engineering; Hardware Product Manager; Operations, Supply Chain; CEO, CTO at small companies</w:t>
             </w:r>
           </w:p>
         </w:tc>
@@ -1185,20 +1185,20 @@
                 <w:sz w:val="20"/>
                 <w:szCs w:val="20"/>
               </w:rPr>
-              <w:t xml:space="preserve">3. Fleet, telematics and logistics hardware</w:t>
-            </w:r>
-          </w:p>
-          <w:p>
-            <w:pPr>
-              <w:spacing w:before="0" w:after="40"/>
-              <w:jc w:val="left"/>
-            </w:pPr>
-            <w:r>
-              <w:rPr>
-                <w:sz w:val="20"/>
-                <w:szCs w:val="20"/>
-              </w:rPr>
-              <w:t xml:space="preserve">GPS tracking, fleet devices, RFID and barcode hardware</w:t>
+              <w:t xml:space="preserve">3. Science instrumentation and education products</w:t>
+            </w:r>
+          </w:p>
+          <w:p>
+            <w:pPr>
+              <w:spacing w:before="0" w:after="40"/>
+              <w:jc w:val="left"/>
+            </w:pPr>
+            <w:r>
+              <w:rPr>
+                <w:sz w:val="20"/>
+                <w:szCs w:val="20"/>
+              </w:rPr>
+              <w:t xml:space="preserve">Classroom and teaching-lab equipment, STEM kits, scientific and lab instruments</w:t>
             </w:r>
           </w:p>
         </w:tc>
@@ -1216,7 +1216,7 @@
                 <w:sz w:val="20"/>
                 <w:szCs w:val="20"/>
               </w:rPr>
-              <w:t xml:space="preserve">Dream prospects: Zonar and logistics hardware. Client: CalAmp. Case studies: voltage booster, barcode scanner, fleet tracking operator panel</w:t>
+              <w:t xml:space="preserve">Website: Science Instrumentation. Six clients (Flinn, Vernier, Carolina, Arbor, School Specialty, VWR) and six case studies. Only Measuring and Control Instrument Manufacturing was searched before, so we use other industries (Education, E-Learning, Wholesale, Research Services) with keywords such as "science education", "STEM", "lab equipment", "classroom" and "scientific instruments". Need the client's OK to approach competitors of their clients</w:t>
             </w:r>
           </w:p>
         </w:tc>
@@ -1234,7 +1234,7 @@
                 <w:sz w:val="20"/>
                 <w:szCs w:val="20"/>
               </w:rPr>
-              <w:t xml:space="preserve">11-500</w:t>
+              <w:t xml:space="preserve">11-1,000</w:t>
             </w:r>
           </w:p>
         </w:tc>
@@ -1252,7 +1252,7 @@
                 <w:sz w:val="20"/>
                 <w:szCs w:val="20"/>
               </w:rPr>
-              <w:t xml:space="preserve">VP/Director of Hardware or Engineering; Hardware Product Manager; Operations, Supply Chain; CEO, CTO at small companies</w:t>
+              <w:t xml:space="preserve">President, CEO; VP/Director of Product Development; Product Manager; Operations, Sourcing</w:t>
             </w:r>
           </w:p>
         </w:tc>
@@ -1274,96 +1274,7 @@
                 <w:sz w:val="20"/>
                 <w:szCs w:val="20"/>
               </w:rPr>
-              <w:t xml:space="preserve">4. Science instrumentation and education products</w:t>
-            </w:r>
-          </w:p>
-          <w:p>
-            <w:pPr>
-              <w:spacing w:before="0" w:after="40"/>
-              <w:jc w:val="left"/>
-            </w:pPr>
-            <w:r>
-              <w:rPr>
-                <w:sz w:val="20"/>
-                <w:szCs w:val="20"/>
-              </w:rPr>
-              <w:t xml:space="preserve">Classroom and teaching-lab equipment, STEM kits, scientific instruments</w:t>
-            </w:r>
-          </w:p>
-        </w:tc>
-        <w:tc>
-          <w:tcPr>
-            <w:tcW w:w="3900" w:type="dxa"/>
-          </w:tcPr>
-          <w:p>
-            <w:pPr>
-              <w:spacing w:before="0" w:after="40"/>
-              <w:jc w:val="left"/>
-            </w:pPr>
-            <w:r>
-              <w:rPr>
-                <w:sz w:val="20"/>
-                <w:szCs w:val="20"/>
-              </w:rPr>
-              <w:t xml:space="preserve">Website: Science Instrumentation. Six clients (Flinn, Vernier, Carolina, Arbor, School Specialty, VWR) and six case studies. A smaller niche. Need the client's OK to approach competitors of their clients</w:t>
-            </w:r>
-          </w:p>
-        </w:tc>
-        <w:tc>
-          <w:tcPr>
-            <w:tcW w:w="1300" w:type="dxa"/>
-          </w:tcPr>
-          <w:p>
-            <w:pPr>
-              <w:spacing w:before="0" w:after="40"/>
-              <w:jc w:val="left"/>
-            </w:pPr>
-            <w:r>
-              <w:rPr>
-                <w:sz w:val="20"/>
-                <w:szCs w:val="20"/>
-              </w:rPr>
-              <w:t xml:space="preserve">11-1,000</w:t>
-            </w:r>
-          </w:p>
-        </w:tc>
-        <w:tc>
-          <w:tcPr>
-            <w:tcW w:w="2180" w:type="dxa"/>
-          </w:tcPr>
-          <w:p>
-            <w:pPr>
-              <w:spacing w:before="0" w:after="40"/>
-              <w:jc w:val="left"/>
-            </w:pPr>
-            <w:r>
-              <w:rPr>
-                <w:sz w:val="20"/>
-                <w:szCs w:val="20"/>
-              </w:rPr>
-              <w:t xml:space="preserve">President, CEO; VP/Director of Product Development; Product Manager; Operations, Sourcing</w:t>
-            </w:r>
-          </w:p>
-        </w:tc>
-      </w:tr>
-      <w:tr>
-        <w:tc>
-          <w:tcPr>
-            <w:tcW w:w="2500" w:type="dxa"/>
-          </w:tcPr>
-          <w:p>
-            <w:pPr>
-              <w:spacing w:before="0" w:after="40"/>
-              <w:jc w:val="left"/>
-            </w:pPr>
-            <w:r>
-              <w:rPr>
-                <w:b w:val="1"/>
-                <w:bCs w:val="1"/>
-                <w:sz w:val="20"/>
-                <w:szCs w:val="20"/>
-              </w:rPr>
-              <w:t xml:space="preserve">5. More from past segments</w:t>
+              <w:t xml:space="preserve">4. More from past segments</w:t>
             </w:r>
           </w:p>
         </w:tc>
@@ -1440,7 +1351,7 @@
           <w:sz w:val="22"/>
           <w:szCs w:val="22"/>
         </w:rPr>
-        <w:t xml:space="preserve">Target 4 is not medical: these are teaching and lab products for schools and universities, which need no FDA approval. Clinical and diagnostic lab devices stay out. Plastics manufacturing is not suggested either: those companies mostly make plastic parts themselves (molding, extrusion) and are closer to Steiner's suppliers than its customers. RVs will be targeted later with Steiner's new RV solution.</w:t>
+        <w:t xml:space="preserve">Target 3 is not medical: these are teaching and lab products for schools and universities, which need no FDA approval. Clinical and diagnostic lab devices stay out. Plastics manufacturing is not suggested either: those companies mostly make plastic parts themselves (molding, extrusion) and are closer to Steiner's suppliers than its customers. RVs stay out for now, as Steiner asked in the past campaigns; we'll target them later with Steiner's new RV solution.</w:t>
       </w:r>
     </w:p>
     <w:p>
@@ -1470,7 +1381,7 @@
     <w:p>
       <w:r>
         <w:rPr/>
-        <w:t xml:space="preserve">We don't rely only on the onboarding form (25-100 employees, $1-100M revenue). In the report, 11-50 employees worked best (4.3% interested on Tom's profile), 51-200 gave 1.4%, and 201-500 gave 2.0% on a small sample. Larger companies were never tried. Steiner's clients range from 11-50 (Holscher, Blichmann) to 201-1,000 (Flinn, Carolina, Suburban, CalAmp, BYK-Gardner), and the RV makers are larger still. So Steiner can serve bigger companies, but the way in is different. Small brands have no engineering team or factories of their own, and the owner decides, so we start there. Brands of 201-1,000 usually have a product or sourcing team and buy from several suppliers, so they're worth a test, but only through sourcing, supply chain and product roles, with longer sales cycles in mind (the onboarding form gives 6-12 months). We leave out 1-10 employees, where volumes are too low (a common “not a good fit” reason), and 1,000+, where formal supplier programs make cold outreach slow, except for specialty divisions, which suit a short hand-picked list for Tom.</w:t>
+        <w:t xml:space="preserve">We don't rely only on the onboarding form (25-100 employees, $1-100M revenue). In the report, 11-50 employees worked best (4.3% interested on Tom's profile), 51-200 gave 1.4%, and 201-500 gave 2.0% on a small sample. Larger companies were never tried. Steiner's clients range from 11-50 (Holscher, Blichmann) to 201-1,000 (Flinn, Carolina, Suburban, CalAmp, BYK-Gardner), and the RV makers are larger still. So Steiner can serve bigger companies, but the way in is different. Small brands have no engineering team or factories of their own, and the owner decides, so we start there. Brands of 201-1,000 usually have a product or sourcing team and buy from several suppliers, so they're worth a test, but only through sourcing, supply chain and product roles, with longer sales cycles in mind (the onboarding form gives 6-12 months). Companies with 1-10 employees were never tested. Some are tiny projects with very small order quantities, but others are brands that outsource everything and sell well, so we test them only with annual revenue of $1M or more. We leave out 1,000+, where formal supplier programs make cold outreach slow, except for specialty divisions, which suit a short hand-picked list for Tom.</w:t>
       </w:r>
     </w:p>
     <w:p>
@@ -1578,7 +1489,7 @@
           <w:sz w:val="22"/>
           <w:szCs w:val="22"/>
         </w:rPr>
-        <w:t xml:space="preserve">Target 2 is the natural second step: the same angle with a vehicle focus. Target 3 is a good test for Josh's profile, given his engineering background.</w:t>
+        <w:t xml:space="preserve">Target 2 (fleet and telematics hardware) is a good test for Josh's profile, given his engineering background. Target 3 follows once Steiner confirms whether we can approach competitors of their education clients.</w:t>
       </w:r>
     </w:p>
     <w:p>
@@ -1755,7 +1666,7 @@
           <w:sz w:val="22"/>
           <w:szCs w:val="22"/>
         </w:rPr>
-        <w:t xml:space="preserve">Before launch, the team checks the live result count for each search. If target 1 gives fewer than about 1,000 new companies at 11-200 employees, we add target 2 straight away.</w:t>
+        <w:t xml:space="preserve">Before launch, the team checks the live result count for each search. If target 1 gives fewer than about 1,000 new companies at 11-200 employees, we start target 2 straight away.</w:t>
       </w:r>
     </w:p>
     <w:p>
@@ -1770,7 +1681,7 @@
     <w:p>
       <w:r>
         <w:rPr/>
-        <w:t xml:space="preserve">Beyond Sales Navigator and Apollo, we looked at two ideas of our own: companies that already import, and companies close to launching a new product. These are the sources, what they cost, and how we'd use them.</w:t>
+        <w:t xml:space="preserve">Beyond Sales Navigator and Apollo, we looked at three ideas of our own: companies that already import, companies close to launching a new product, and companies that have a prototype. These are the sources, what they cost, and how we'd use them.</w:t>
       </w:r>
     </w:p>
     <w:tbl>
@@ -2556,6 +2467,139 @@
     </w:p>
     <w:p>
       <w:pPr>
+        <w:pStyle w:val="Heading3"/>
+      </w:pPr>
+      <w:r>
+        <w:rPr/>
+        <w:t xml:space="preserve">Companies that have a prototype</w:t>
+      </w:r>
+    </w:p>
+    <w:p>
+      <w:r>
+        <w:rPr/>
+        <w:t xml:space="preserve">This makes sense for Steiner. Prototyping and pre-production are on its capabilities list, and “Your Idea Brought to Life” is one of its three project types (the cell phone photometer started as “a rough concept of a box”). The past campaigns show the need: Miftek replied “we have a prototype instrument - needs some rethinking”, EIC Solutions was “looking to bring in some contracted product development”, and the Sources tab already lists “companies that have a prototype” as an idea for the future. The risk is size: some prototype teams have no funding and only need a few units. So we only approach teams that have money behind the product.</w:t>
+      </w:r>
+    </w:p>
+    <w:p>
+      <w:r>
+        <w:rPr/>
+        <w:t xml:space="preserve">Where to find them:</w:t>
+      </w:r>
+    </w:p>
+    <w:p>
+      <w:pPr>
+        <w:numPr>
+          <w:ilvl w:val="0"/>
+          <w:numId w:val="2"/>
+        </w:numPr>
+        <w:spacing w:after="0" w:before="120" w:lineRule="auto"/>
+        <w:ind w:left="720" w:hanging="360"/>
+      </w:pPr>
+      <w:r>
+        <w:rPr>
+          <w:b w:val="1"/>
+          <w:bCs w:val="1"/>
+        </w:rPr>
+        <w:t xml:space="preserve">Kickstarter and Indiegogo:</w:t>
+      </w:r>
+      <w:r>
+        <w:rPr/>
+        <w:t xml:space="preserve"> hardware projects that are funded or in pre-order (free).</w:t>
+      </w:r>
+    </w:p>
+    <w:p>
+      <w:pPr>
+        <w:numPr>
+          <w:ilvl w:val="0"/>
+          <w:numId w:val="2"/>
+        </w:numPr>
+        <w:spacing w:after="0" w:before="120" w:lineRule="auto"/>
+        <w:ind w:left="720" w:hanging="360"/>
+      </w:pPr>
+      <w:r>
+        <w:rPr>
+          <w:b w:val="1"/>
+          <w:bCs w:val="1"/>
+        </w:rPr>
+        <w:t xml:space="preserve">SBIR/STTR awards:</w:t>
+      </w:r>
+      <w:r>
+        <w:rPr/>
+        <w:t xml:space="preserve"> small US companies with government funding to develop and prototype new technology. Phase II awards fund working prototypes (free search at </w:t>
+      </w:r>
+      <w:hyperlink r:id="rIdL7">
+        <w:r>
+          <w:rPr>
+            <w:color w:val="1155CC"/>
+            <w:u w:val="single"/>
+          </w:rPr>
+          <w:t xml:space="preserve">https://www.sbir.gov/awards</w:t>
+        </w:r>
+      </w:hyperlink>
+      <w:r>
+        <w:rPr/>
+        <w:t xml:space="preserve">).</w:t>
+      </w:r>
+    </w:p>
+    <w:p>
+      <w:pPr>
+        <w:numPr>
+          <w:ilvl w:val="0"/>
+          <w:numId w:val="2"/>
+        </w:numPr>
+        <w:spacing w:after="0" w:before="120" w:lineRule="auto"/>
+        <w:ind w:left="720" w:hanging="360"/>
+      </w:pPr>
+      <w:r>
+        <w:rPr>
+          <w:b w:val="1"/>
+          <w:bCs w:val="1"/>
+        </w:rPr>
+        <w:t xml:space="preserve">Crunchbase and Apollo:</w:t>
+      </w:r>
+      <w:r>
+        <w:rPr/>
+        <w:t xml:space="preserve"> hardware startups with a recent seed or Series A round. The report's Exported tab already has funding data for part of the list.</w:t>
+      </w:r>
+    </w:p>
+    <w:p>
+      <w:pPr>
+        <w:numPr>
+          <w:ilvl w:val="0"/>
+          <w:numId w:val="2"/>
+        </w:numPr>
+        <w:spacing w:after="0" w:before="120" w:lineRule="auto"/>
+        <w:ind w:left="720" w:hanging="360"/>
+      </w:pPr>
+      <w:r>
+        <w:rPr>
+          <w:b w:val="1"/>
+          <w:bCs w:val="1"/>
+        </w:rPr>
+        <w:t xml:space="preserve">LinkedIn:</w:t>
+      </w:r>
+      <w:r>
+        <w:rPr/>
+        <w:t xml:space="preserve"> company posts and job posts that mention "prototype", "pilot run", "first production run" or "NPI" (new product introduction).</w:t>
+      </w:r>
+    </w:p>
+    <w:p>
+      <w:pPr>
+        <w:spacing w:before="60" w:after="120"/>
+      </w:pPr>
+      <w:r>
+        <w:rPr>
+          <w:i w:val="1"/>
+          <w:iCs w:val="1"/>
+          <w:color w:val="404040"/>
+          <w:sz w:val="22"/>
+          <w:szCs w:val="22"/>
+        </w:rPr>
+        <w:t xml:space="preserve">Message angle: “from prototype to production”. Steiner can review the design for cost and manufacturability, then build the first runs. Size: 1-50 employees, with funding or revenue as the filter rather than headcount.</w:t>
+      </w:r>
+    </w:p>
+    <w:p>
+      <w:pPr>
         <w:pStyle w:val="Heading2"/>
       </w:pPr>
       <w:r>
@@ -2566,7 +2610,7 @@
     <w:p>
       <w:r>
         <w:rPr/>
-        <w:t xml:space="preserve">We send connection requests from Tom's profile, followed by four LinkedIn messages. Each message comes from a different angle, so if one doesn't land, the next one might. After four, we stop. Josh's profile can test target 3 in parallel.</w:t>
+        <w:t xml:space="preserve">We send connection requests from Tom's profile, followed by four LinkedIn messages. Each message comes from a different angle, so if one doesn't land, the next one might. After four, we stop. Josh's profile can test target 2 in parallel.</w:t>
       </w:r>
     </w:p>
     <w:p>
@@ -4094,7 +4138,7 @@
       </w:r>
       <w:r>
         <w:rPr/>
-        <w:t xml:space="preserve"> can we approach competitors of the current education clients (target 4)?</w:t>
+        <w:t xml:space="preserve"> can we approach competitors of the current education clients (target 3)?</w:t>
       </w:r>
     </w:p>
     <w:p>
@@ -4203,7 +4247,7 @@
         <w:rPr/>
         <w:t xml:space="preserve"> </w:t>
       </w:r>
-      <w:hyperlink r:id="rIdL7">
+      <w:hyperlink r:id="rIdL8">
         <w:r>
           <w:rPr>
             <w:color w:val="1155CC"/>
@@ -4237,7 +4281,7 @@
         <w:rPr/>
         <w:t xml:space="preserve"> </w:t>
       </w:r>
-      <w:hyperlink r:id="rIdL8">
+      <w:hyperlink r:id="rIdL9">
         <w:r>
           <w:rPr>
             <w:color w:val="1155CC"/>
@@ -4267,7 +4311,7 @@
         <w:rPr/>
         <w:t xml:space="preserve"> </w:t>
       </w:r>
-      <w:hyperlink r:id="rIdL9">
+      <w:hyperlink r:id="rIdL10">
         <w:r>
           <w:rPr>
             <w:color w:val="1155CC"/>

</xml_diff>

<commit_message>
Keep covered electronics industries out of the Steiner starting target
Co-Authored-By: Claude Opus 5.5 <noreply@anthropic.com>
Claude-Session: https://claude.ai/code/session_018AsKRCDgw5Ln2FqTPH9DBq
</commit_message>
<xml_diff>
--- a/Outreach Messages - Steiner Enterprises 2026.docx
+++ b/Outreach Messages - Steiner Enterprises 2026.docx
@@ -1020,7 +1020,7 @@
                 <w:sz w:val="20"/>
                 <w:szCs w:val="20"/>
               </w:rPr>
-              <w:t xml:space="preserve">Home and garden, outdoor and sporting, hardware, pet, lighting and small electronics, sold through retail and online</w:t>
+              <w:t xml:space="preserve">Home and garden, outdoor and sporting, hardware and pet products, sold through retail and online</w:t>
             </w:r>
           </w:p>
         </w:tc>
@@ -1038,7 +1038,7 @@
                 <w:sz w:val="20"/>
                 <w:szCs w:val="20"/>
               </w:rPr>
-              <w:t xml:space="preserve">Website: Consumer Goods, Commercial and Retail. Dream prospects: Ace Hardware and Tractor Supply vendors. Clients: Holscher, Fisher Athletic, Blichmann. Case studies: fan, LED light, speaker, USB charger, pole box sets. Interested before: Audeze, Coastal Source, Insteon, Big Dot Lighting</w:t>
+              <w:t xml:space="preserve">Website: Consumer Goods, Commercial and Retail. Dream prospects: Ace Hardware and Tractor Supply vendors. Clients: Holscher, Fisher Athletic, Blichmann. Case studies: fan, LED light, speaker, USB charger, pole box sets. Similar brands were interested before (Audeze, Coastal Source, Insteon, Big Dot Lighting), but they came from electronics searches, which are already covered</w:t>
             </w:r>
           </w:p>
         </w:tc>
@@ -1546,7 +1546,7 @@
       </w:r>
       <w:r>
         <w:rPr/>
-        <w:t xml:space="preserve"> Sporting Goods Manufacturing, Furniture and Home Furnishings Manufacturing, Household Appliance Manufacturing, Consumer Goods, Retail and Wholesale. Industry names can differ slightly in Sales Navigator, so pick the closest match.</w:t>
+        <w:t xml:space="preserve"> Sporting Goods Manufacturing, Furniture and Home Furnishings Manufacturing, Consumer Goods, Retail and Wholesale. Industry names can differ slightly in Sales Navigator, so pick the closest match.</w:t>
       </w:r>
     </w:p>
     <w:p>
@@ -1630,7 +1630,7 @@
       </w:r>
       <w:r>
         <w:rPr/>
-        <w:t xml:space="preserve"> the 4,254 companies in the report databases, existing clients, retailers themselves (we want the brands that supply them), RV companies, and distributors with no products of their own.</w:t>
+        <w:t xml:space="preserve"> industries already covered (Computers and Electronics Manufacturing, including Computer Hardware Manufacturing; Appliances, Electrical, and Electronics Manufacturing, including household appliances and lighting; Electrical Equipment; Electric Lighting), the 4,254 companies in the report databases, existing clients, retailers themselves (we want the brands that supply them), RV companies, and distributors with no products of their own.</w:t>
       </w:r>
     </w:p>
     <w:p>

</xml_diff>

<commit_message>
Replace the ambiguous hardware wording in the Steiner starting target
Co-Authored-By: Claude Opus 5.5 <noreply@anthropic.com>
Claude-Session: https://claude.ai/code/session_018AsKRCDgw5Ln2FqTPH9DBq
</commit_message>
<xml_diff>
--- a/Outreach Messages - Steiner Enterprises 2026.docx
+++ b/Outreach Messages - Steiner Enterprises 2026.docx
@@ -1020,7 +1020,7 @@
                 <w:sz w:val="20"/>
                 <w:szCs w:val="20"/>
               </w:rPr>
-              <w:t xml:space="preserve">Home and garden, outdoor and sporting, hardware and pet products, sold through retail and online</w:t>
+              <w:t xml:space="preserve">Home and garden, outdoor and sporting, tools and home improvement, and pet products, sold through retail and online</w:t>
             </w:r>
           </w:p>
         </w:tc>
@@ -1453,7 +1453,7 @@
       </w:r>
       <w:r>
         <w:rPr/>
-        <w:t xml:space="preserve"> home, garden, outdoor, sporting, pet and hardware brands are a large group, and none of them have been contacted.</w:t>
+        <w:t xml:space="preserve"> home and garden, outdoor, sporting, tools and home improvement, and pet brands are a large group, and none of them have been contacted.</w:t>
       </w:r>
     </w:p>
     <w:p>
@@ -1567,7 +1567,7 @@
       </w:r>
       <w:r>
         <w:rPr/>
-        <w:t xml:space="preserve"> "lawn and garden" OR "outdoor products" OR "pet products" OR "camping" OR "hunting" OR "fishing" OR "grilling" OR "home improvement" OR "hardware" OR "Tractor Supply" OR "Ace Hardware" OR "sold at"</w:t>
+        <w:t xml:space="preserve"> "lawn and garden" OR "outdoor products" OR "pet products" OR "camping" OR "hunting" OR "fishing" OR "grilling" OR "home improvement" OR "hand tools" OR "power tools" OR "Tractor Supply" OR "Ace Hardware" OR "sold at"</w:t>
       </w:r>
     </w:p>
     <w:p>

</xml_diff>

<commit_message>
Cite the official FDA final rule for the Steiner medical device note
Co-Authored-By: Claude Opus 5.5 <noreply@anthropic.com>
Claude-Session: https://claude.ai/code/session_018AsKRCDgw5Ln2FqTPH9DBq
</commit_message>
<xml_diff>
--- a/Outreach Messages - Steiner Enterprises 2026.docx
+++ b/Outreach Messages - Steiner Enterprises 2026.docx
@@ -4271,15 +4271,8 @@
         <w:ind w:left="720" w:hanging="360"/>
       </w:pPr>
       <w:r>
-        <w:rPr>
-          <w:b w:val="1"/>
-          <w:bCs w:val="1"/>
-        </w:rPr>
-        <w:t xml:space="preserve">FDA quality system rule (QMSR), effective February 2, 2026:</w:t>
-      </w:r>
-      <w:r>
-        <w:rPr/>
-        <w:t xml:space="preserve"> </w:t>
+        <w:rPr/>
+        <w:t xml:space="preserve">FDA Quality Management System Regulation (final rule, effective February 2, 2026), used for the FDA note on medical device manufacturing: </w:t>
       </w:r>
       <w:hyperlink r:id="rIdL9">
         <w:r>
@@ -4287,7 +4280,7 @@
             <w:color w:val="1155CC"/>
             <w:u w:val="single"/>
           </w:rPr>
-          <w:t xml:space="preserve">https://www.fda.gov/media/190399/download</w:t>
+          <w:t xml:space="preserve">https://www.federalregister.gov/documents/2024/02/02/2024-01709/medical-devices-quality-system-regulation-amendments</w:t>
         </w:r>
       </w:hyperlink>
     </w:p>

</xml_diff>